<commit_message>
docs: add comprehensive project README and architecture screenshots
</commit_message>
<xml_diff>
--- a/Jarvis — Architecture on Cloudflare.docx
+++ b/Jarvis — Architecture on Cloudflare.docx
@@ -17,6 +17,18 @@
       </w:r>
     </w:p>
     <w:p>
+      <w:pPr/>
+      <w:r>
+        <w:rPr>
+          <w:b/>
+        </w:rPr>
+        <w:t xml:space="preserve">Updated to match the final build.</w:t>
+      </w:r>
+      <w:r>
+        <w:t xml:space="preserve"> The sections from Component design onward describe what was built; the README in the repo has the current architecture diagram and run instructions.</w:t>
+      </w:r>
+    </w:p>
+    <w:p>
       <w:pPr>
         <w:pStyle w:val="Heading2"/>
       </w:pPr>
@@ -59,47 +71,59 @@
         <w:pStyle w:val="ListParagraph"/>
         <w:numPr>
           <w:ilvl w:val="0"/>
-          <w:numId w:val="2"/>
-        </w:numPr>
-      </w:pPr>
-      <w:r>
-        <w:t xml:space="preserve">Streaming chat on Llama 3.3 (Workers AI), with voice input</w:t>
-      </w:r>
-    </w:p>
-    <w:p>
-      <w:pPr>
-        <w:pStyle w:val="ListParagraph"/>
-        <w:numPr>
-          <w:ilvl w:val="0"/>
-          <w:numId w:val="2"/>
-        </w:numPr>
-      </w:pPr>
-      <w:r>
-        <w:t xml:space="preserve">Long-term memory of user facts, plus tasks and notes, visible on request ("What do you remember about me?")</w:t>
-      </w:r>
-    </w:p>
-    <w:p>
-      <w:pPr>
-        <w:pStyle w:val="ListParagraph"/>
-        <w:numPr>
-          <w:ilvl w:val="0"/>
-          <w:numId w:val="2"/>
-        </w:numPr>
-      </w:pPr>
-      <w:r>
-        <w:t xml:space="preserve">Reminders and a daily briefing that the agent schedules for itself</w:t>
-      </w:r>
-    </w:p>
-    <w:p>
-      <w:pPr>
-        <w:pStyle w:val="ListParagraph"/>
-        <w:numPr>
-          <w:ilvl w:val="0"/>
-          <w:numId w:val="2"/>
-        </w:numPr>
-      </w:pPr>
-      <w:r>
-        <w:t xml:space="preserve">A briefing pipeline run as a durable, retryable Workflow</w:t>
+          <w:numId w:val="4"/>
+        </w:numPr>
+      </w:pPr>
+      <w:r>
+        <w:t xml:space="preserve">Voice first: a 3D character you talk to (push-to-talk, spoken replies, expressions and lip-sync), plus a chat view of the same history</w:t>
+      </w:r>
+    </w:p>
+    <w:p>
+      <w:pPr>
+        <w:pStyle w:val="ListParagraph"/>
+        <w:numPr>
+          <w:ilvl w:val="0"/>
+          <w:numId w:val="4"/>
+        </w:numPr>
+      </w:pPr>
+      <w:r>
+        <w:t xml:space="preserve">Long-term memory of facts, tasks and notes, visible and editable ("What do you remember about me?")</w:t>
+      </w:r>
+    </w:p>
+    <w:p>
+      <w:pPr>
+        <w:pStyle w:val="ListParagraph"/>
+        <w:numPr>
+          <w:ilvl w:val="0"/>
+          <w:numId w:val="4"/>
+        </w:numPr>
+      </w:pPr>
+      <w:r>
+        <w:t xml:space="preserve">A daily morning briefing run as a durable Workflow, and reminders that Jarvis announces out loud</w:t>
+      </w:r>
+    </w:p>
+    <w:p>
+      <w:pPr>
+        <w:pStyle w:val="ListParagraph"/>
+        <w:numPr>
+          <w:ilvl w:val="0"/>
+          <w:numId w:val="4"/>
+        </w:numPr>
+      </w:pPr>
+      <w:r>
+        <w:t xml:space="preserve">Tools from OpenAPI specs and MCP servers the user connects, with approval for anything that writes</w:t>
+      </w:r>
+    </w:p>
+    <w:p>
+      <w:pPr>
+        <w:pStyle w:val="ListParagraph"/>
+        <w:numPr>
+          <w:ilvl w:val="0"/>
+          <w:numId w:val="4"/>
+        </w:numPr>
+      </w:pPr>
+      <w:r>
+        <w:t xml:space="preserve">Keeps working when the Workers AI free allowance runs out, and says so</w:t>
       </w:r>
     </w:p>
     <w:p>
@@ -116,11 +140,11 @@
         <w:pStyle w:val="ListParagraph"/>
         <w:numPr>
           <w:ilvl w:val="0"/>
-          <w:numId w:val="3"/>
-        </w:numPr>
-      </w:pPr>
-      <w:r>
-        <w:t xml:space="preserve">Email, calendar or Slack integration</w:t>
+          <w:numId w:val="4"/>
+        </w:numPr>
+      </w:pPr>
+      <w:r>
+        <w:t xml:space="preserve">Built-in email, calendar or Slack (they can be connected as MCP servers instead)</w:t>
       </w:r>
     </w:p>
     <w:p>
@@ -256,7 +280,7 @@
           <w:p>
             <w:pPr/>
             <w:r>
-              <w:t xml:space="preserve">Chat replies with tool calling; fact extraction; briefing writer</w:t>
+              <w:t xml:space="preserve">Chat with tool calling; fact extraction (JSON mode); the briefing. Whisper and Deepgram Aura-2 on Workers AI for speech</w:t>
             </w:r>
           </w:p>
         </w:tc>
@@ -326,7 +350,7 @@
           <w:p>
             <w:pPr/>
             <w:r>
-              <w:t xml:space="preserve">React chat UI streamed over a WebSocket; mic input transcribed by Workers AI Whisper</w:t>
+              <w:t xml:space="preserve">A voice screen with a 3D character (push-to-talk, spoken replies) and a chat view, both over one WebSocket and one history</w:t>
             </w:r>
           </w:p>
         </w:tc>
@@ -361,16 +385,7 @@
           <w:p>
             <w:pPr/>
             <w:r>
-              <w:t xml:space="preserve">Synced settings in </w:t>
-            </w:r>
-            <w:r>
-              <w:rPr>
-                <w:rStyle w:val="CodeChar"/>
-              </w:rPr>
-              <w:t xml:space="preserve">state</w:t>
-            </w:r>
-            <w:r>
-              <w:t xml:space="preserve">; facts, tasks, notes and history in SQL tables</w:t>
+              <w:t xml:space="preserve">Synced state for the briefing, reminders and limits; facts, tasks, notes and connected APIs in the agent's SQLite</w:t>
             </w:r>
           </w:p>
         </w:tc>
@@ -439,6 +454,12 @@
       </w:r>
     </w:p>
     <w:p>
+      <w:pPr/>
+      <w:r>
+        <w:t xml:space="preserve">This diagram shows the original design. The final build adds backups for when the free allowance runs out (Ollama Cloud, Groq, the browser's speech APIs), connected APIs and MCP servers, and the 3D voice screen; the README has the updated diagram.</w:t>
+      </w:r>
+    </w:p>
+    <w:p>
       <w:pPr>
         <w:pStyle w:val="Heading2"/>
       </w:pPr>
@@ -449,7 +470,7 @@
     <w:p>
       <w:pPr/>
       <w:r>
-        <w:t xml:space="preserve">One Worker serves the UI and routes to a per-user agent; the agent owns all state and hands long jobs to a Workflow.</w:t>
+        <w:t xml:space="preserve">One Worker serves the app and routes each browser to its own agent. The agent owns all of that user's data and hands the briefing to a Workflow.</w:t>
       </w:r>
     </w:p>
     <w:p>
@@ -470,83 +491,301 @@
         </w:numPr>
       </w:pPr>
       <w:r>
-        <w:t xml:space="preserve">Chat UI built on the starter's </w:t>
+        <w:t xml:space="preserve">Two modes over one shared history: a voice screen (the default) and a chat view</w:t>
+      </w:r>
+    </w:p>
+    <w:p>
+      <w:pPr>
+        <w:pStyle w:val="ListParagraph"/>
+        <w:numPr>
+          <w:ilvl w:val="0"/>
+          <w:numId w:val="4"/>
+        </w:numPr>
+      </w:pPr>
+      <w:r>
+        <w:t xml:space="preserve">Voice screen: a 3D VRM character rendered with three.js and </w:t>
       </w:r>
       <w:r>
         <w:rPr>
           <w:rStyle w:val="CodeChar"/>
         </w:rPr>
+        <w:t xml:space="preserve">@pixiv/three-vrm</w:t>
+      </w:r>
+      <w:r>
+        <w:t xml:space="preserve">, push-to-talk with Ctrl+Space or a button, captions, approval cards, history and memory drawers, and a character picker</w:t>
+      </w:r>
+    </w:p>
+    <w:p>
+      <w:pPr>
+        <w:pStyle w:val="ListParagraph"/>
+        <w:numPr>
+          <w:ilvl w:val="0"/>
+          <w:numId w:val="4"/>
+        </w:numPr>
+      </w:pPr>
+      <w:r>
+        <w:t xml:space="preserve">Chat view: the starter's </w:t>
+      </w:r>
+      <w:r>
+        <w:rPr>
+          <w:rStyle w:val="CodeChar"/>
+        </w:rPr>
         <w:t xml:space="preserve">useAgentChat</w:t>
       </w:r>
       <w:r>
-        <w:t xml:space="preserve"> hook; streamed tokens over a WebSocket</w:t>
-      </w:r>
-    </w:p>
-    <w:p>
-      <w:pPr>
-        <w:pStyle w:val="ListParagraph"/>
-        <w:numPr>
-          <w:ilvl w:val="0"/>
-          <w:numId w:val="4"/>
-        </w:numPr>
-      </w:pPr>
-      <w:r>
-        <w:t xml:space="preserve">Mic button: records a short clip (up to 30 s) and sends it to the agent's </w:t>
+        <w:t xml:space="preserve"> UI with a mic button, a side panel (briefing, reminders, facts, tasks, notes) and an Integrations dialog</w:t>
+      </w:r>
+    </w:p>
+    <w:p>
+      <w:pPr>
+        <w:pStyle w:val="ListParagraph"/>
+        <w:numPr>
+          <w:ilvl w:val="0"/>
+          <w:numId w:val="4"/>
+        </w:numPr>
+      </w:pPr>
+      <w:r>
+        <w:t xml:space="preserve">Each browser gets a random, unguessable agent ID kept in local storage, so every visitor has their own Jarvis</w:t>
+      </w:r>
+    </w:p>
+    <w:p>
+      <w:pPr/>
+      <w:r>
+        <w:rPr>
+          <w:b/>
+        </w:rPr>
+        <w:t xml:space="preserve">2. Worker entry (</w:t>
       </w:r>
       <w:r>
         <w:rPr>
           <w:rStyle w:val="CodeChar"/>
-        </w:rPr>
-        <w:t xml:space="preserve">transcribe()</w:t>
-      </w:r>
-      <w:r>
-        <w:t xml:space="preserve"> method; the transcript fills the input box so the user can fix it before sending</w:t>
-      </w:r>
-    </w:p>
-    <w:p>
-      <w:pPr>
-        <w:pStyle w:val="ListParagraph"/>
-        <w:numPr>
-          <w:ilvl w:val="0"/>
-          <w:numId w:val="4"/>
-        </w:numPr>
-      </w:pPr>
-      <w:r>
-        <w:t xml:space="preserve">Side panel: "Memory" (facts), "Tasks", fired reminders and the latest briefing, all driven by agent state updates via </w:t>
-      </w:r>
+          <w:b/>
+        </w:rPr>
+        <w:t xml:space="preserve">src/server.ts</w:t>
+      </w:r>
+      <w:r>
+        <w:rPr>
+          <w:b/>
+        </w:rPr>
+        <w:t xml:space="preserve">)</w:t>
+      </w:r>
+    </w:p>
+    <w:p>
+      <w:pPr>
+        <w:pStyle w:val="ListParagraph"/>
+        <w:numPr>
+          <w:ilvl w:val="0"/>
+          <w:numId w:val="4"/>
+        </w:numPr>
+      </w:pPr>
       <w:r>
         <w:rPr>
           <w:rStyle w:val="CodeChar"/>
         </w:rPr>
-        <w:t xml:space="preserve">useAgent</w:t>
-      </w:r>
-    </w:p>
-    <w:p>
-      <w:pPr>
-        <w:pStyle w:val="ListParagraph"/>
-        <w:numPr>
-          <w:ilvl w:val="0"/>
-          <w:numId w:val="4"/>
-        </w:numPr>
-      </w:pPr>
-      <w:r>
-        <w:t xml:space="preserve">Instance name = a random ID stored in the browser, so each visitor gets their own Jarvis</w:t>
-      </w:r>
-    </w:p>
-    <w:p>
-      <w:pPr/>
-      <w:r>
-        <w:rPr>
-          <w:b/>
-        </w:rPr>
-        <w:t xml:space="preserve">2. Worker entry (</w:t>
+        <w:t xml:space="preserve">routeAgentRequest()</w:t>
+      </w:r>
+      <w:r>
+        <w:t xml:space="preserve"> sends </w:t>
       </w:r>
       <w:r>
         <w:rPr>
           <w:rStyle w:val="CodeChar"/>
-          <w:b/>
-        </w:rPr>
-        <w:t xml:space="preserve">src/server.ts</w:t>
+        </w:rPr>
+        <w:t xml:space="preserve">/agents/jarvis-agent/&lt;id&gt;</w:t>
+      </w:r>
+      <w:r>
+        <w:t xml:space="preserve"> to the right Durable Object</w:t>
+      </w:r>
+    </w:p>
+    <w:p>
+      <w:pPr>
+        <w:pStyle w:val="ListParagraph"/>
+        <w:numPr>
+          <w:ilvl w:val="0"/>
+          <w:numId w:val="4"/>
+        </w:numPr>
+      </w:pPr>
+      <w:r>
+        <w:t xml:space="preserve">Serves the app and the character models as static assets</w:t>
+      </w:r>
+    </w:p>
+    <w:p>
+      <w:pPr>
+        <w:pStyle w:val="ListParagraph"/>
+        <w:numPr>
+          <w:ilvl w:val="0"/>
+          <w:numId w:val="4"/>
+        </w:numPr>
+      </w:pPr>
+      <w:r>
+        <w:t xml:space="preserve">Exports the agent class and the Workflow class</w:t>
+      </w:r>
+    </w:p>
+    <w:p>
+      <w:pPr/>
+      <w:r>
+        <w:rPr>
+          <w:b/>
+        </w:rPr>
+        <w:t xml:space="preserve">3. JarvisAgent (</w:t>
+      </w:r>
+      <w:r>
+        <w:rPr>
+          <w:rStyle w:val="CodeChar"/>
+          <w:b/>
+        </w:rPr>
+        <w:t xml:space="preserve">AIChatAgent</w:t>
+      </w:r>
+      <w:r>
+        <w:rPr>
+          <w:b/>
+        </w:rPr>
+        <w:t xml:space="preserve">, one Durable Object per user)</w:t>
+      </w:r>
+    </w:p>
+    <w:p>
+      <w:pPr>
+        <w:pStyle w:val="ListParagraph"/>
+        <w:numPr>
+          <w:ilvl w:val="0"/>
+          <w:numId w:val="4"/>
+        </w:numPr>
+      </w:pPr>
+      <w:r>
+        <w:t xml:space="preserve">Runs the chat loop: builds the prompt from memory, calls Llama 3.3 with tools, streams the reply</w:t>
+      </w:r>
+    </w:p>
+    <w:p>
+      <w:pPr>
+        <w:pStyle w:val="ListParagraph"/>
+        <w:numPr>
+          <w:ilvl w:val="0"/>
+          <w:numId w:val="4"/>
+        </w:numPr>
+      </w:pPr>
+      <w:r>
+        <w:t xml:space="preserve">Owns SQLite tables for facts, tasks, notes and connected APIs; the SDK stores connected MCP servers</w:t>
+      </w:r>
+    </w:p>
+    <w:p>
+      <w:pPr>
+        <w:pStyle w:val="ListParagraph"/>
+        <w:numPr>
+          <w:ilvl w:val="0"/>
+          <w:numId w:val="4"/>
+        </w:numPr>
+      </w:pPr>
+      <w:r>
+        <w:t xml:space="preserve">Exposes </w:t>
+      </w:r>
+      <w:r>
+        <w:rPr>
+          <w:rStyle w:val="CodeChar"/>
+        </w:rPr>
+        <w:t xml:space="preserve">@callable()</w:t>
+      </w:r>
+      <w:r>
+        <w:t xml:space="preserve"> methods to the UI for memory, the briefing, reminders, transcription, speech and integrations</w:t>
+      </w:r>
+    </w:p>
+    <w:p>
+      <w:pPr>
+        <w:pStyle w:val="ListParagraph"/>
+        <w:numPr>
+          <w:ilvl w:val="0"/>
+          <w:numId w:val="4"/>
+        </w:numPr>
+      </w:pPr>
+      <w:r>
+        <w:t xml:space="preserve">Uses </w:t>
+      </w:r>
+      <w:r>
+        <w:rPr>
+          <w:rStyle w:val="CodeChar"/>
+        </w:rPr>
+        <w:t xml:space="preserve">this.schedule()</w:t>
+      </w:r>
+      <w:r>
+        <w:t xml:space="preserve"> for reminders (one-off) and the daily briefing (cron, in UTC)</w:t>
+      </w:r>
+    </w:p>
+    <w:p>
+      <w:pPr>
+        <w:pStyle w:val="ListParagraph"/>
+        <w:numPr>
+          <w:ilvl w:val="0"/>
+          <w:numId w:val="4"/>
+        </w:numPr>
+      </w:pPr>
+      <w:r>
+        <w:t xml:space="preserve">Extracts new facts in the background after each turn (</w:t>
+      </w:r>
+      <w:r>
+        <w:rPr>
+          <w:rStyle w:val="CodeChar"/>
+        </w:rPr>
+        <w:t xml:space="preserve">onChatResponse</w:t>
+      </w:r>
+      <w:r>
+        <w:t xml:space="preserve"> and the SDK's built-in queue)</w:t>
+      </w:r>
+    </w:p>
+    <w:p>
+      <w:pPr/>
+      <w:r>
+        <w:rPr>
+          <w:b/>
+        </w:rPr>
+        <w:t xml:space="preserve">4. Models</w:t>
+      </w:r>
+    </w:p>
+    <w:p>
+      <w:pPr>
+        <w:pStyle w:val="ListParagraph"/>
+        <w:numPr>
+          <w:ilvl w:val="0"/>
+          <w:numId w:val="4"/>
+        </w:numPr>
+      </w:pPr>
+      <w:r>
+        <w:t xml:space="preserve">Workers AI: Llama 3.3 70B (chat, tools, fact extraction in JSON mode, the briefing), Whisper large-v3-turbo (speech to text) and Deepgram Aura-2 (text to speech)</w:t>
+      </w:r>
+    </w:p>
+    <w:p>
+      <w:pPr>
+        <w:pStyle w:val="ListParagraph"/>
+        <w:numPr>
+          <w:ilvl w:val="0"/>
+          <w:numId w:val="4"/>
+        </w:numPr>
+      </w:pPr>
+      <w:r>
+        <w:t xml:space="preserve">Backups, only while the daily free allowance is used up: Ollama Cloud (</w:t>
+      </w:r>
+      <w:r>
+        <w:rPr>
+          <w:rStyle w:val="CodeChar"/>
+        </w:rPr>
+        <w:t xml:space="preserve">gpt-oss:120b</w:t>
+      </w:r>
+      <w:r>
+        <w:t xml:space="preserve">) for text, Groq Whisper for speech to text, and the browser's speech APIs as a last resort</w:t>
+      </w:r>
+    </w:p>
+    <w:p>
+      <w:pPr/>
+      <w:r>
+        <w:rPr>
+          <w:b/>
+        </w:rPr>
+        <w:t xml:space="preserve">5. MorningBriefingWorkflow (</w:t>
+      </w:r>
+      <w:r>
+        <w:rPr>
+          <w:rStyle w:val="CodeChar"/>
+          <w:b/>
+        </w:rPr>
+        <w:t xml:space="preserve">AgentWorkflow</w:t>
       </w:r>
       <w:r>
         <w:rPr>
@@ -560,221 +799,77 @@
         <w:pStyle w:val="ListParagraph"/>
         <w:numPr>
           <w:ilvl w:val="0"/>
-          <w:numId w:val="5"/>
-        </w:numPr>
-      </w:pPr>
+          <w:numId w:val="4"/>
+        </w:numPr>
+      </w:pPr>
+      <w:r>
+        <w:t xml:space="preserve">Started with </w:t>
+      </w:r>
       <w:r>
         <w:rPr>
           <w:rStyle w:val="CodeChar"/>
         </w:rPr>
-        <w:t xml:space="preserve">routeAgentRequest()</w:t>
-      </w:r>
-      <w:r>
-        <w:t xml:space="preserve"> sends </w:t>
+        <w:t xml:space="preserve">this.runWorkflow()</w:t>
+      </w:r>
+      <w:r>
+        <w:t xml:space="preserve">. Steps: load-context (an RPC call to the agent through </w:t>
       </w:r>
       <w:r>
         <w:rPr>
           <w:rStyle w:val="CodeChar"/>
         </w:rPr>
-        <w:t xml:space="preserve">/agents/jarvis-agent/&lt;id&gt;</w:t>
-      </w:r>
-      <w:r>
-        <w:t xml:space="preserve"> to the right Durable Object</w:t>
-      </w:r>
-    </w:p>
-    <w:p>
-      <w:pPr>
-        <w:pStyle w:val="ListParagraph"/>
-        <w:numPr>
-          <w:ilvl w:val="0"/>
-          <w:numId w:val="5"/>
-        </w:numPr>
-      </w:pPr>
-      <w:r>
-        <w:t xml:space="preserve">Serves static assets for every other path</w:t>
-      </w:r>
-    </w:p>
-    <w:p>
-      <w:pPr>
-        <w:pStyle w:val="ListParagraph"/>
-        <w:numPr>
-          <w:ilvl w:val="0"/>
-          <w:numId w:val="5"/>
-        </w:numPr>
-      </w:pPr>
-      <w:r>
-        <w:t xml:space="preserve">Exports the agent class and the Workflow class</w:t>
-      </w:r>
-    </w:p>
-    <w:p>
-      <w:pPr/>
-      <w:r>
-        <w:rPr>
-          <w:b/>
-        </w:rPr>
-        <w:t xml:space="preserve">3. JarvisAgent (Agents SDK chat agent, one Durable Object per user)</w:t>
-      </w:r>
-    </w:p>
-    <w:p>
-      <w:pPr>
-        <w:pStyle w:val="ListParagraph"/>
-        <w:numPr>
-          <w:ilvl w:val="0"/>
-          <w:numId w:val="6"/>
-        </w:numPr>
-      </w:pPr>
-      <w:r>
-        <w:t xml:space="preserve">Runs the chat loop: builds the prompt, calls Llama 3.3, executes tools, streams the reply</w:t>
-      </w:r>
-    </w:p>
-    <w:p>
-      <w:pPr>
-        <w:pStyle w:val="ListParagraph"/>
-        <w:numPr>
-          <w:ilvl w:val="0"/>
-          <w:numId w:val="6"/>
-        </w:numPr>
-      </w:pPr>
-      <w:r>
-        <w:t xml:space="preserve">Stores everything in its own SQLite; exposes </w:t>
+        <w:t xml:space="preserve">this.agent</w:t>
+      </w:r>
+      <w:r>
+        <w:t xml:space="preserve">), then compose (Llama 3.3, retried up to 3 times with exponential backoff)</w:t>
+      </w:r>
+    </w:p>
+    <w:p>
+      <w:pPr>
+        <w:pStyle w:val="ListParagraph"/>
+        <w:numPr>
+          <w:ilvl w:val="0"/>
+          <w:numId w:val="4"/>
+        </w:numPr>
+      </w:pPr>
+      <w:r>
+        <w:t xml:space="preserve">Saves the briefing with </w:t>
       </w:r>
       <w:r>
         <w:rPr>
           <w:rStyle w:val="CodeChar"/>
         </w:rPr>
-        <w:t xml:space="preserve">@callable()</w:t>
-      </w:r>
-      <w:r>
-        <w:t xml:space="preserve"> methods to the UI (list facts, delete task, run briefing now)</w:t>
-      </w:r>
-    </w:p>
-    <w:p>
-      <w:pPr>
-        <w:pStyle w:val="ListParagraph"/>
-        <w:numPr>
-          <w:ilvl w:val="0"/>
-          <w:numId w:val="6"/>
-        </w:numPr>
-      </w:pPr>
-      <w:r>
-        <w:t xml:space="preserve">Uses </w:t>
+        <w:t xml:space="preserve">step.mergeAgentState()</w:t>
+      </w:r>
+      <w:r>
+        <w:t xml:space="preserve"> and reports with </w:t>
       </w:r>
       <w:r>
         <w:rPr>
           <w:rStyle w:val="CodeChar"/>
         </w:rPr>
-        <w:t xml:space="preserve">this.schedule()</w:t>
-      </w:r>
-      <w:r>
-        <w:t xml:space="preserve"> for one-off reminders and a daily cron for the briefing; cron strings run in UTC, so local times are converted first</w:t>
-      </w:r>
-    </w:p>
-    <w:p>
-      <w:pPr>
-        <w:pStyle w:val="ListParagraph"/>
-        <w:numPr>
-          <w:ilvl w:val="0"/>
-          <w:numId w:val="6"/>
-        </w:numPr>
-      </w:pPr>
-      <w:r>
-        <w:t xml:space="preserve">Starts </w:t>
+        <w:t xml:space="preserve">step.reportComplete()</w:t>
+      </w:r>
+      <w:r>
+        <w:t xml:space="preserve">. The agent posts it into the chat in </w:t>
       </w:r>
       <w:r>
         <w:rPr>
           <w:rStyle w:val="CodeChar"/>
         </w:rPr>
-        <w:t xml:space="preserve">MorningBriefingWorkflow</w:t>
-      </w:r>
-      <w:r>
-        <w:t xml:space="preserve"> with its own instance name as a parameter, and exposes RPC methods the Workflow calls to read context, save the briefing or report a failure</w:t>
-      </w:r>
-    </w:p>
-    <w:p>
-      <w:pPr/>
-      <w:r>
-        <w:rPr>
-          <w:b/>
-        </w:rPr>
-        <w:t xml:space="preserve">4. Workers AI</w:t>
-      </w:r>
-    </w:p>
-    <w:p>
-      <w:pPr>
-        <w:pStyle w:val="ListParagraph"/>
-        <w:numPr>
-          <w:ilvl w:val="0"/>
-          <w:numId w:val="7"/>
-        </w:numPr>
-      </w:pPr>
+        <w:t xml:space="preserve">onWorkflowComplete</w:t>
+      </w:r>
+      <w:r>
+        <w:t xml:space="preserve">, and records a failure in </w:t>
+      </w:r>
       <w:r>
         <w:rPr>
           <w:rStyle w:val="CodeChar"/>
         </w:rPr>
-        <w:t xml:space="preserve">@cf/meta/llama-3.3-70b-instruct-fp8-fast</w:t>
-      </w:r>
-      <w:r>
-        <w:t xml:space="preserve"> for chat, tools and the briefing (confirm the model ID in the catalog before building)</w:t>
-      </w:r>
-    </w:p>
-    <w:p>
-      <w:pPr>
-        <w:pStyle w:val="ListParagraph"/>
-        <w:numPr>
-          <w:ilvl w:val="0"/>
-          <w:numId w:val="7"/>
-        </w:numPr>
-      </w:pPr>
-      <w:r>
-        <w:rPr>
-          <w:rStyle w:val="CodeChar"/>
-        </w:rPr>
-        <w:t xml:space="preserve">@cf/openai/whisper-large-v3-turbo</w:t>
-      </w:r>
-      <w:r>
-        <w:t xml:space="preserve"> for speech-to-text (confirm it accepts the browser's webm/opus recording; if not, record WAV in the browser)</w:t>
-      </w:r>
-    </w:p>
-    <w:p>
-      <w:pPr/>
-      <w:r>
-        <w:rPr>
-          <w:b/>
-        </w:rPr>
-        <w:t xml:space="preserve">5. MorningBriefingWorkflow (Cloudflare Workflows)</w:t>
-      </w:r>
-    </w:p>
-    <w:p>
-      <w:pPr>
-        <w:pStyle w:val="ListParagraph"/>
-        <w:numPr>
-          <w:ilvl w:val="0"/>
-          <w:numId w:val="8"/>
-        </w:numPr>
-      </w:pPr>
-      <w:r>
-        <w:t xml:space="preserve">Durable steps with automatic retries; each step's output is saved, so a failure resumes mid-run</w:t>
-      </w:r>
-    </w:p>
-    <w:p>
-      <w:pPr>
-        <w:pStyle w:val="ListParagraph"/>
-        <w:numPr>
-          <w:ilvl w:val="0"/>
-          <w:numId w:val="8"/>
-        </w:numPr>
-      </w:pPr>
-      <w:r>
-        <w:t xml:space="preserve">Looks up the agent by the instance name it was started with (</w:t>
-      </w:r>
-      <w:r>
-        <w:rPr>
-          <w:rStyle w:val="CodeChar"/>
-        </w:rPr>
-        <w:t xml:space="preserve">getAgentByName()</w:t>
-      </w:r>
-      <w:r>
-        <w:t xml:space="preserve">), reads context through the agent's RPC methods, asks the LLM to compose and writes the result back the same way</w:t>
+        <w:t xml:space="preserve">onWorkflowError</w:t>
+      </w:r>
+      <w:r>
+        <w:t xml:space="preserve"> so the UI can show it</w:t>
       </w:r>
     </w:p>
     <w:p>
@@ -788,16 +883,7 @@
     <w:p>
       <w:pPr/>
       <w:r>
-        <w:t xml:space="preserve">All memory lives inside the user's own agent: small, UI-facing data in synced </w:t>
-      </w:r>
-      <w:r>
-        <w:rPr>
-          <w:rStyle w:val="CodeChar"/>
-        </w:rPr>
-        <w:t xml:space="preserve">state</w:t>
-      </w:r>
-      <w:r>
-        <w:t xml:space="preserve">; growing data in SQL tables. No external database is needed.</w:t>
+        <w:t xml:space="preserve">All memory lives inside the user's own agent: small, UI-facing data in synced state, and growing data in SQL tables. No external database is needed.</w:t>
       </w:r>
     </w:p>
     <w:p>
@@ -905,7 +991,7 @@
           <w:p>
             <w:pPr/>
             <w:r>
-              <w:t xml:space="preserve">One conversation window</w:t>
+              <w:t xml:space="preserve">Fitted to the token budget</w:t>
             </w:r>
           </w:p>
         </w:tc>
@@ -916,7 +1002,7 @@
           <w:p>
             <w:pPr/>
             <w:r>
-              <w:t xml:space="preserve">Up to 20 recent turns, trimmed to the token budget</w:t>
+              <w:t xml:space="preserve">Up to 20 recent turns</w:t>
             </w:r>
           </w:p>
         </w:tc>
@@ -946,7 +1032,7 @@
               <w:t xml:space="preserve">facts</w:t>
             </w:r>
             <w:r>
-              <w:t xml:space="preserve"> table, injected into the system prompt</w:t>
+              <w:t xml:space="preserve"> table, in the system prompt</w:t>
             </w:r>
           </w:p>
         </w:tc>
@@ -1007,7 +1093,7 @@
               <w:t xml:space="preserve">notes</w:t>
             </w:r>
             <w:r>
-              <w:t xml:space="preserve"> tables</w:t>
+              <w:t xml:space="preserve"> tables; reminders as schedules</w:t>
             </w:r>
           </w:p>
         </w:tc>
@@ -1061,25 +1147,27 @@
       <w:pPr>
         <w:pStyle w:val="Code"/>
       </w:pPr>
-      <w:bookmarkStart w:id="1" w:name="bongo_lang_ts_1"/>
-      <w:bookmarkEnd w:id="1"/>
       <w:r>
         <w:t xml:space="preserve">type JarvisState = {</w:t>
         <w:br/>
-        <w:t xml:space="preserve">  displayName?: string;</w:t>
+        <w:t xml:space="preserve">  timezone: string;              // from the browser, e.g. "Asia/Kolkata"</w:t>
         <w:br/>
-        <w:t xml:space="preserve">  timezone: string;            // e.g. "Asia/Kolkata"</w:t>
+        <w:t xml:space="preserve">  briefingTime?: string;         // daily local "08:00"; unset = off</w:t>
         <w:br/>
-        <w:t xml:space="preserve">  briefingTime?: string;       // "08:00" local, or unset = off</w:t>
-        <w:br/>
-        <w:t xml:space="preserve">  briefingScheduleId?: string; // so a time change cancels the old cron</w:t>
+        <w:t xml:space="preserve">  briefingScheduleId?: string;   // so a new time replaces the old cron</w:t>
         <w:br/>
         <w:t xml:space="preserve">  lastBriefing?: { text: string; createdAt: string };</w:t>
         <w:br/>
         <w:t xml:space="preserve">  workflowStatus?: "idle" | "running" | "failed";</w:t>
         <w:br/>
+        <w:t xml:space="preserve">  briefingStartedAt?: string;</w:t>
+        <w:br/>
+        <w:t xml:space="preserve">  briefingError?: string | null;</w:t>
+        <w:br/>
         <w:t xml:space="preserve">  inbox?: { id: string; text: string; firedAt: string }[]; // fired reminders</w:t>
         <w:br/>
+        <w:t xml:space="preserve">  aiLimit?: { until: string; fallbackModel: string | null } | null;</w:t>
+        <w:br/>
         <w:t xml:space="preserve">};</w:t>
       </w:r>
     </w:p>
@@ -1109,29 +1197,414 @@
       <w:pPr>
         <w:pStyle w:val="Code"/>
       </w:pPr>
-      <w:bookmarkStart w:id="2" w:name="bongo_lang_sql_2"/>
-      <w:bookmarkEnd w:id="2"/>
       <w:r>
         <w:t xml:space="preserve">CREATE TABLE facts (id TEXT PRIMARY KEY, text TEXT, source_msg TEXT, created_at TEXT);</w:t>
         <w:br/>
         <w:t xml:space="preserve">CREATE TABLE tasks (id TEXT PRIMARY KEY, title TEXT, due_at TEXT, done INTEGER DEFAULT 0);</w:t>
         <w:br/>
         <w:t xml:space="preserve">CREATE TABLE notes (id TEXT PRIMARY KEY, body TEXT, created_at TEXT);</w:t>
-      </w:r>
-    </w:p>
-    <w:p>
-      <w:pPr/>
-      <w:r>
-        <w:t xml:space="preserve">Chat history is persisted by the SDK's chat agent itself. Rule of thumb: if the UI must react to it instantly, it goes in </w:t>
+        <w:br/>
+        <w:t xml:space="preserve">CREATE TABLE api_sources (id TEXT PRIMARY KEY, name TEXT, slug TEXT, base_url TEXT,</w:t>
+        <w:br/>
+        <w:t xml:space="preserve">  spec TEXT, spec_url TEXT, auth_header TEXT, auth_value TEXT, created_at TEXT);</w:t>
+      </w:r>
+    </w:p>
+    <w:p>
+      <w:pPr/>
+      <w:r>
+        <w:t xml:space="preserve">The panel reads the SQL data through a callable method and refetches it when the agent broadcasts a change; state updates arrive by themselves. Chat history is stored by the SDK's chat agent.</w:t>
+      </w:r>
+    </w:p>
+    <w:p>
+      <w:pPr>
+        <w:pStyle w:val="Heading2"/>
+      </w:pPr>
+      <w:r>
+        <w:t xml:space="preserve">Key flows</w:t>
+      </w:r>
+    </w:p>
+    <w:p>
+      <w:pPr/>
+      <w:r>
+        <w:t xml:space="preserve">Five flows carry the app: a spoken turn, memory extraction after it, the morning briefing, reminders, and connected tools.</w:t>
+      </w:r>
+    </w:p>
+    <w:p>
+      <w:pPr/>
+      <w:r>
+        <w:rPr>
+          <w:b/>
+        </w:rPr>
+        <w:t xml:space="preserve">A. A spoken turn</w:t>
+      </w:r>
+    </w:p>
+    <w:p>
+      <w:pPr>
+        <w:pStyle w:val="ListParagraph"/>
+        <w:numPr>
+          <w:ilvl w:val="0"/>
+          <w:numId w:val="17"/>
+        </w:numPr>
+      </w:pPr>
+      <w:r>
+        <w:t xml:space="preserve">The user holds Ctrl+Space (or taps the mic). The browser records and converts the clip to 16 kHz WAV.</w:t>
+      </w:r>
+    </w:p>
+    <w:p>
+      <w:pPr>
+        <w:pStyle w:val="ListParagraph"/>
+        <w:numPr>
+          <w:ilvl w:val="0"/>
+          <w:numId w:val="17"/>
+        </w:numPr>
+      </w:pPr>
+      <w:r>
+        <w:t xml:space="preserve">The agent transcribes it with Whisper (or Groq), and the text is sent as the user's message.</w:t>
+      </w:r>
+    </w:p>
+    <w:p>
+      <w:pPr>
+        <w:pStyle w:val="ListParagraph"/>
+        <w:numPr>
+          <w:ilvl w:val="0"/>
+          <w:numId w:val="17"/>
+        </w:numPr>
+      </w:pPr>
+      <w:r>
+        <w:t xml:space="preserve">The agent builds the prompt from memory within Llama 3.3's 24K-token context and runs the model with the tools.</w:t>
+      </w:r>
+    </w:p>
+    <w:p>
+      <w:pPr>
+        <w:pStyle w:val="ListParagraph"/>
+        <w:numPr>
+          <w:ilvl w:val="0"/>
+          <w:numId w:val="17"/>
+        </w:numPr>
+      </w:pPr>
+      <w:r>
+        <w:t xml:space="preserve">Tool calls run against the agent's SQLite, its scheduler or connected APIs; destructive or writing calls wait for approval.</w:t>
+      </w:r>
+    </w:p>
+    <w:p>
+      <w:pPr>
+        <w:pStyle w:val="ListParagraph"/>
+        <w:numPr>
+          <w:ilvl w:val="0"/>
+          <w:numId w:val="17"/>
+        </w:numPr>
+      </w:pPr>
+      <w:r>
+        <w:t xml:space="preserve">The reply streams back and is spoken with Aura-2 (or the browser's voice) while the character's mouth follows the audio.</w:t>
+      </w:r>
+    </w:p>
+    <w:p>
+      <w:pPr/>
+      <w:r>
+        <w:rPr>
+          <w:b/>
+        </w:rPr>
+        <w:t xml:space="preserve">B. Memory extraction</w:t>
+      </w:r>
+    </w:p>
+    <w:p>
+      <w:pPr>
+        <w:pStyle w:val="ListParagraph"/>
+        <w:numPr>
+          <w:ilvl w:val="0"/>
+          <w:numId w:val="18"/>
+        </w:numPr>
+      </w:pPr>
+      <w:r>
+        <w:t xml:space="preserve">After the reply is saved, </w:t>
       </w:r>
       <w:r>
         <w:rPr>
           <w:rStyle w:val="CodeChar"/>
         </w:rPr>
-        <w:t xml:space="preserve">state</w:t>
-      </w:r>
-      <w:r>
-        <w:t xml:space="preserve">; if it grows without bound, it goes in SQL.</w:t>
+        <w:t xml:space="preserve">onChatResponse</w:t>
+      </w:r>
+      <w:r>
+        <w:t xml:space="preserve"> queues a background job with the user's message.</w:t>
+      </w:r>
+    </w:p>
+    <w:p>
+      <w:pPr>
+        <w:pStyle w:val="ListParagraph"/>
+        <w:numPr>
+          <w:ilvl w:val="0"/>
+          <w:numId w:val="18"/>
+        </w:numPr>
+      </w:pPr>
+      <w:r>
+        <w:t xml:space="preserve">Llama 3.3 in JSON mode returns new facts, given the known facts so paraphrases are skipped.</w:t>
+      </w:r>
+    </w:p>
+    <w:p>
+      <w:pPr>
+        <w:pStyle w:val="ListParagraph"/>
+        <w:numPr>
+          <w:ilvl w:val="0"/>
+          <w:numId w:val="18"/>
+        </w:numPr>
+      </w:pPr>
+      <w:r>
+        <w:t xml:space="preserve">New facts go into </w:t>
+      </w:r>
+      <w:r>
+        <w:rPr>
+          <w:rStyle w:val="CodeChar"/>
+        </w:rPr>
+        <w:t xml:space="preserve">facts</w:t>
+      </w:r>
+      <w:r>
+        <w:t xml:space="preserve">; the panel updates live and a "Jarvis will remember" note appears.</w:t>
+      </w:r>
+    </w:p>
+    <w:p>
+      <w:pPr/>
+      <w:r>
+        <w:rPr>
+          <w:b/>
+        </w:rPr>
+        <w:t xml:space="preserve">C. Morning briefing</w:t>
+      </w:r>
+    </w:p>
+    <w:p>
+      <w:pPr>
+        <w:pStyle w:val="ListParagraph"/>
+        <w:numPr>
+          <w:ilvl w:val="0"/>
+          <w:numId w:val="19"/>
+        </w:numPr>
+      </w:pPr>
+      <w:r>
+        <w:t xml:space="preserve">"Brief me every morning at 8": </w:t>
+      </w:r>
+      <w:r>
+        <w:rPr>
+          <w:rStyle w:val="CodeChar"/>
+        </w:rPr>
+        <w:t xml:space="preserve">set_briefing</w:t>
+      </w:r>
+      <w:r>
+        <w:t xml:space="preserve"> converts the local time to a UTC cron (08:00 Asia/Kolkata is </w:t>
+      </w:r>
+      <w:r>
+        <w:rPr>
+          <w:rStyle w:val="CodeChar"/>
+        </w:rPr>
+        <w:t xml:space="preserve">30 2 * * *</w:t>
+      </w:r>
+      <w:r>
+        <w:t xml:space="preserve">) and replaces any earlier schedule.</w:t>
+      </w:r>
+    </w:p>
+    <w:p>
+      <w:pPr>
+        <w:pStyle w:val="ListParagraph"/>
+        <w:numPr>
+          <w:ilvl w:val="0"/>
+          <w:numId w:val="19"/>
+        </w:numPr>
+      </w:pPr>
+      <w:r>
+        <w:t xml:space="preserve">At that time the agent starts </w:t>
+      </w:r>
+      <w:r>
+        <w:rPr>
+          <w:rStyle w:val="CodeChar"/>
+        </w:rPr>
+        <w:t xml:space="preserve">MorningBriefingWorkflow</w:t>
+      </w:r>
+      <w:r>
+        <w:t xml:space="preserve"> (a "Run briefing now" button does the same on demand).</w:t>
+      </w:r>
+    </w:p>
+    <w:p>
+      <w:pPr>
+        <w:pStyle w:val="ListParagraph"/>
+        <w:numPr>
+          <w:ilvl w:val="0"/>
+          <w:numId w:val="19"/>
+        </w:numPr>
+      </w:pPr>
+      <w:r>
+        <w:t xml:space="preserve">load-context reads today's tasks, reminders, notes and facts from the agent; compose writes the briefing with Llama 3.3.</w:t>
+      </w:r>
+    </w:p>
+    <w:p>
+      <w:pPr>
+        <w:pStyle w:val="ListParagraph"/>
+        <w:numPr>
+          <w:ilvl w:val="0"/>
+          <w:numId w:val="19"/>
+        </w:numPr>
+      </w:pPr>
+      <w:r>
+        <w:t xml:space="preserve">The result is saved into agent state and posted into the chat, and Jarvis announces it on the voice screen.</w:t>
+      </w:r>
+    </w:p>
+    <w:p>
+      <w:pPr>
+        <w:pStyle w:val="ListParagraph"/>
+        <w:numPr>
+          <w:ilvl w:val="0"/>
+          <w:numId w:val="19"/>
+        </w:numPr>
+      </w:pPr>
+      <w:r>
+        <w:t xml:space="preserve">If compose still fails after its retries, </w:t>
+      </w:r>
+      <w:r>
+        <w:rPr>
+          <w:rStyle w:val="CodeChar"/>
+        </w:rPr>
+        <w:t xml:space="preserve">onWorkflowError</w:t>
+      </w:r>
+      <w:r>
+        <w:t xml:space="preserve"> marks the run failed and the panel shows why.</w:t>
+      </w:r>
+    </w:p>
+    <w:p>
+      <w:pPr/>
+      <w:r>
+        <w:rPr>
+          <w:b/>
+        </w:rPr>
+        <w:t xml:space="preserve">D. Reminders</w:t>
+      </w:r>
+    </w:p>
+    <w:p>
+      <w:pPr>
+        <w:pStyle w:val="ListParagraph"/>
+        <w:numPr>
+          <w:ilvl w:val="0"/>
+          <w:numId w:val="20"/>
+        </w:numPr>
+      </w:pPr>
+      <w:r>
+        <w:rPr>
+          <w:rStyle w:val="CodeChar"/>
+        </w:rPr>
+        <w:t xml:space="preserve">set_reminder</w:t>
+      </w:r>
+      <w:r>
+        <w:t xml:space="preserve"> takes minutes from now or a local time, converts it to UTC and calls </w:t>
+      </w:r>
+      <w:r>
+        <w:rPr>
+          <w:rStyle w:val="CodeChar"/>
+        </w:rPr>
+        <w:t xml:space="preserve">this.schedule()</w:t>
+      </w:r>
+      <w:r>
+        <w:t xml:space="preserve">.</w:t>
+      </w:r>
+    </w:p>
+    <w:p>
+      <w:pPr>
+        <w:pStyle w:val="ListParagraph"/>
+        <w:numPr>
+          <w:ilvl w:val="0"/>
+          <w:numId w:val="20"/>
+        </w:numPr>
+      </w:pPr>
+      <w:r>
+        <w:t xml:space="preserve">Upcoming reminders are listed in the prompt with their IDs, so the user can ask about or cancel one.</w:t>
+      </w:r>
+    </w:p>
+    <w:p>
+      <w:pPr>
+        <w:pStyle w:val="ListParagraph"/>
+        <w:numPr>
+          <w:ilvl w:val="0"/>
+          <w:numId w:val="20"/>
+        </w:numPr>
+      </w:pPr>
+      <w:r>
+        <w:t xml:space="preserve">When one fires, it goes into </w:t>
+      </w:r>
+      <w:r>
+        <w:rPr>
+          <w:rStyle w:val="CodeChar"/>
+        </w:rPr>
+        <w:t xml:space="preserve">state.inbox</w:t>
+      </w:r>
+      <w:r>
+        <w:t xml:space="preserve"> and is broadcast; Jarvis says it out loud, shows it as a caption and sends a browser notification.</w:t>
+      </w:r>
+    </w:p>
+    <w:p>
+      <w:pPr/>
+      <w:r>
+        <w:rPr>
+          <w:b/>
+        </w:rPr>
+        <w:t xml:space="preserve">E. Connected tools</w:t>
+      </w:r>
+    </w:p>
+    <w:p>
+      <w:pPr>
+        <w:pStyle w:val="ListParagraph"/>
+        <w:numPr>
+          <w:ilvl w:val="0"/>
+          <w:numId w:val="21"/>
+        </w:numPr>
+      </w:pPr>
+      <w:r>
+        <w:t xml:space="preserve">An OpenAPI 3.x spec (pasted or fetched) becomes MCP-style tools: names from </w:t>
+      </w:r>
+      <w:r>
+        <w:rPr>
+          <w:rStyle w:val="CodeChar"/>
+        </w:rPr>
+        <w:t xml:space="preserve">operationId</w:t>
+      </w:r>
+      <w:r>
+        <w:t xml:space="preserve">, path parameters required, query and header parameters optional, the JSON body as a </w:t>
+      </w:r>
+      <w:r>
+        <w:rPr>
+          <w:rStyle w:val="CodeChar"/>
+        </w:rPr>
+        <w:t xml:space="preserve">body</w:t>
+      </w:r>
+      <w:r>
+        <w:t xml:space="preserve"> argument.</w:t>
+      </w:r>
+    </w:p>
+    <w:p>
+      <w:pPr>
+        <w:pStyle w:val="ListParagraph"/>
+        <w:numPr>
+          <w:ilvl w:val="0"/>
+          <w:numId w:val="21"/>
+        </w:numPr>
+      </w:pPr>
+      <w:r>
+        <w:t xml:space="preserve">MCP servers are added with the SDK's </w:t>
+      </w:r>
+      <w:r>
+        <w:rPr>
+          <w:rStyle w:val="CodeChar"/>
+        </w:rPr>
+        <w:t xml:space="preserve">addMcpServer()</w:t>
+      </w:r>
+      <w:r>
+        <w:t xml:space="preserve">, which stores them and reconnects after restarts.</w:t>
+      </w:r>
+    </w:p>
+    <w:p>
+      <w:pPr>
+        <w:pStyle w:val="ListParagraph"/>
+        <w:numPr>
+          <w:ilvl w:val="0"/>
+          <w:numId w:val="21"/>
+        </w:numPr>
+      </w:pPr>
+      <w:r>
+        <w:t xml:space="preserve">Both are offered to the model alongside the built-in tools. Read-only calls run directly; anything else asks first. Their output is treated as data, not instructions.</w:t>
       </w:r>
     </w:p>
     <w:p>
@@ -1139,522 +1612,13 @@
         <w:pStyle w:val="Heading2"/>
       </w:pPr>
       <w:r>
-        <w:t xml:space="preserve">Key flows</w:t>
-      </w:r>
-    </w:p>
-    <w:p>
-      <w:pPr/>
-      <w:r>
-        <w:t xml:space="preserve">Four flows carry the demo: a chat turn, memory extraction after it, the scheduled briefing and reminders.</w:t>
-      </w:r>
-    </w:p>
-    <w:p>
-      <w:pPr/>
-      <w:r>
-        <w:rPr>
-          <w:b/>
-        </w:rPr>
-        <w:t xml:space="preserve">A. Chat turn</w:t>
-      </w:r>
-    </w:p>
-    <w:p>
-      <w:pPr>
-        <w:pStyle w:val="ListParagraph"/>
-        <w:numPr>
-          <w:ilvl w:val="0"/>
-          <w:numId w:val="9"/>
-        </w:numPr>
-      </w:pPr>
-      <w:r>
-        <w:t xml:space="preserve">User types, or speaks (Whisper turns the clip into text in the input box, and the user sends it).</w:t>
-      </w:r>
-    </w:p>
-    <w:p>
-      <w:pPr>
-        <w:pStyle w:val="ListParagraph"/>
-        <w:numPr>
-          <w:ilvl w:val="0"/>
-          <w:numId w:val="9"/>
-        </w:numPr>
-      </w:pPr>
-      <w:r>
-        <w:t xml:space="preserve">The message reaches </w:t>
-      </w:r>
-      <w:r>
-        <w:rPr>
-          <w:rStyle w:val="CodeChar"/>
-        </w:rPr>
-        <w:t xml:space="preserve">JarvisAgent</w:t>
-      </w:r>
-      <w:r>
-        <w:t xml:space="preserve"> over the open WebSocket.</w:t>
-      </w:r>
-    </w:p>
-    <w:p>
-      <w:pPr>
-        <w:pStyle w:val="ListParagraph"/>
-        <w:numPr>
-          <w:ilvl w:val="0"/>
-          <w:numId w:val="9"/>
-        </w:numPr>
-      </w:pPr>
-      <w:r>
-        <w:t xml:space="preserve">The agent builds the prompt: system prompt + all </w:t>
-      </w:r>
-      <w:r>
-        <w:rPr>
-          <w:rStyle w:val="CodeChar"/>
-        </w:rPr>
-        <w:t xml:space="preserve">facts</w:t>
-      </w:r>
-      <w:r>
-        <w:t xml:space="preserve"> + open </w:t>
-      </w:r>
-      <w:r>
-        <w:rPr>
-          <w:rStyle w:val="CodeChar"/>
-        </w:rPr>
-        <w:t xml:space="preserve">tasks</w:t>
-      </w:r>
-      <w:r>
-        <w:t xml:space="preserve"> + upcoming reminders + as much recent history as fits the token budget.</w:t>
-      </w:r>
-    </w:p>
-    <w:p>
-      <w:pPr>
-        <w:pStyle w:val="ListParagraph"/>
-        <w:numPr>
-          <w:ilvl w:val="0"/>
-          <w:numId w:val="9"/>
-        </w:numPr>
-      </w:pPr>
-      <w:r>
-        <w:t xml:space="preserve">Llama 3.3 replies, possibly with tool calls (</w:t>
-      </w:r>
-      <w:r>
-        <w:rPr>
-          <w:rStyle w:val="CodeChar"/>
-        </w:rPr>
-        <w:t xml:space="preserve">add_task</w:t>
-      </w:r>
-      <w:r>
-        <w:t xml:space="preserve">, </w:t>
-      </w:r>
-      <w:r>
-        <w:rPr>
-          <w:rStyle w:val="CodeChar"/>
-        </w:rPr>
-        <w:t xml:space="preserve">set_reminder</w:t>
-      </w:r>
-      <w:r>
-        <w:t xml:space="preserve">, …).</w:t>
-      </w:r>
-    </w:p>
-    <w:p>
-      <w:pPr>
-        <w:pStyle w:val="ListParagraph"/>
-        <w:numPr>
-          <w:ilvl w:val="0"/>
-          <w:numId w:val="9"/>
-        </w:numPr>
-      </w:pPr>
-      <w:r>
-        <w:t xml:space="preserve">The agent runs the tools against its SQLite or scheduler, then streams the final answer.</w:t>
-      </w:r>
-    </w:p>
-    <w:p>
-      <w:pPr>
-        <w:pStyle w:val="ListParagraph"/>
-        <w:numPr>
-          <w:ilvl w:val="0"/>
-          <w:numId w:val="9"/>
-        </w:numPr>
-      </w:pPr>
-      <w:r>
-        <w:t xml:space="preserve">Changed data is pushed to the side panel through a </w:t>
-      </w:r>
-      <w:r>
-        <w:rPr>
-          <w:rStyle w:val="CodeChar"/>
-        </w:rPr>
-        <w:t xml:space="preserve">setState</w:t>
-      </w:r>
-      <w:r>
-        <w:t xml:space="preserve"> broadcast.</w:t>
-      </w:r>
-    </w:p>
-    <w:p>
-      <w:pPr/>
-      <w:r>
-        <w:rPr>
-          <w:b/>
-        </w:rPr>
-        <w:t xml:space="preserve">B. Memory extraction</w:t>
-      </w:r>
-    </w:p>
-    <w:p>
-      <w:pPr>
-        <w:pStyle w:val="ListParagraph"/>
-        <w:numPr>
-          <w:ilvl w:val="0"/>
-          <w:numId w:val="10"/>
-        </w:numPr>
-      </w:pPr>
-      <w:r>
-        <w:t xml:space="preserve">After the reply has finished streaming, a background LLM call gets the user's message and the current facts, and returns only new facts as JSON (or nothing). This is the only way facts are added, so there is no separate "remember" tool.</w:t>
-      </w:r>
-    </w:p>
-    <w:p>
-      <w:pPr>
-        <w:pStyle w:val="ListParagraph"/>
-        <w:numPr>
-          <w:ilvl w:val="0"/>
-          <w:numId w:val="10"/>
-        </w:numPr>
-      </w:pPr>
-      <w:r>
-        <w:t xml:space="preserve">Because the model sees the existing facts, it skips paraphrases ("doesn't eat meat" vs "is vegetarian") that an exact-match check would miss. New facts are inserted into </w:t>
-      </w:r>
-      <w:r>
-        <w:rPr>
-          <w:rStyle w:val="CodeChar"/>
-        </w:rPr>
-        <w:t xml:space="preserve">facts</w:t>
-      </w:r>
-      <w:r>
-        <w:t xml:space="preserve">.</w:t>
-      </w:r>
-    </w:p>
-    <w:p>
-      <w:pPr>
-        <w:pStyle w:val="ListParagraph"/>
-        <w:numPr>
-          <w:ilvl w:val="0"/>
-          <w:numId w:val="10"/>
-        </w:numPr>
-      </w:pPr>
-      <w:r>
-        <w:t xml:space="preserve">The UI's Memory panel updates live. The user can delete any fact.</w:t>
-      </w:r>
-    </w:p>
-    <w:p>
-      <w:pPr/>
-      <w:r>
-        <w:rPr>
-          <w:b/>
-        </w:rPr>
-        <w:t xml:space="preserve">C. Scheduled morning briefing</w:t>
-      </w:r>
-    </w:p>
-    <w:p>
-      <w:pPr>
-        <w:pStyle w:val="ListParagraph"/>
-        <w:numPr>
-          <w:ilvl w:val="0"/>
-          <w:numId w:val="11"/>
-        </w:numPr>
-      </w:pPr>
-      <w:r>
-        <w:t xml:space="preserve">When the user says "brief me every morning at 8", </w:t>
-      </w:r>
-      <w:r>
-        <w:rPr>
-          <w:rStyle w:val="CodeChar"/>
-        </w:rPr>
-        <w:t xml:space="preserve">set_briefing</w:t>
-      </w:r>
-      <w:r>
-        <w:t xml:space="preserve"> converts 08:00 in the user's timezone to a UTC cron (08:00 Asia/Kolkata is </w:t>
-      </w:r>
-      <w:r>
-        <w:rPr>
-          <w:rStyle w:val="CodeChar"/>
-        </w:rPr>
-        <w:t xml:space="preserve">30 2 * * *</w:t>
-      </w:r>
-      <w:r>
-        <w:t xml:space="preserve">), cancels the previous briefing schedule if there is one, registers the new cron with </w:t>
-      </w:r>
-      <w:r>
-        <w:rPr>
-          <w:rStyle w:val="CodeChar"/>
-        </w:rPr>
-        <w:t xml:space="preserve">this.schedule()</w:t>
-      </w:r>
-      <w:r>
-        <w:t xml:space="preserve"> and saves its ID in state.</w:t>
-      </w:r>
-    </w:p>
-    <w:p>
-      <w:pPr>
-        <w:pStyle w:val="ListParagraph"/>
-        <w:numPr>
-          <w:ilvl w:val="0"/>
-          <w:numId w:val="11"/>
-        </w:numPr>
-      </w:pPr>
-      <w:r>
-        <w:t xml:space="preserve">At 08:00 local time the agent wakes from hibernation, sets </w:t>
-      </w:r>
-      <w:r>
-        <w:rPr>
-          <w:rStyle w:val="CodeChar"/>
-        </w:rPr>
-        <w:t xml:space="preserve">workflowStatus</w:t>
-      </w:r>
-      <w:r>
-        <w:t xml:space="preserve"> to "running" and creates a </w:t>
-      </w:r>
-      <w:r>
-        <w:rPr>
-          <w:rStyle w:val="CodeChar"/>
-        </w:rPr>
-        <w:t xml:space="preserve">MorningBriefingWorkflow</w:t>
-      </w:r>
-      <w:r>
-        <w:t xml:space="preserve"> instance, passing its own instance name.</w:t>
-      </w:r>
-    </w:p>
-    <w:p>
-      <w:pPr>
-        <w:pStyle w:val="ListParagraph"/>
-        <w:numPr>
-          <w:ilvl w:val="0"/>
-          <w:numId w:val="11"/>
-        </w:numPr>
-      </w:pPr>
-      <w:r>
-        <w:t xml:space="preserve">Step 1, </w:t>
-      </w:r>
-      <w:r>
-        <w:rPr>
-          <w:rStyle w:val="CodeChar"/>
-        </w:rPr>
-        <w:t xml:space="preserve">load-context</w:t>
-      </w:r>
-      <w:r>
-        <w:t xml:space="preserve">: the Workflow gets the agent with </w:t>
-      </w:r>
-      <w:r>
-        <w:rPr>
-          <w:rStyle w:val="CodeChar"/>
-        </w:rPr>
-        <w:t xml:space="preserve">getAgentByName()</w:t>
-      </w:r>
-      <w:r>
-        <w:t xml:space="preserve"> and calls its RPC method for tasks due today, recent notes and facts.</w:t>
-      </w:r>
-    </w:p>
-    <w:p>
-      <w:pPr>
-        <w:pStyle w:val="ListParagraph"/>
-        <w:numPr>
-          <w:ilvl w:val="0"/>
-          <w:numId w:val="11"/>
-        </w:numPr>
-      </w:pPr>
-      <w:r>
-        <w:t xml:space="preserve">Step 2, </w:t>
-      </w:r>
-      <w:r>
-        <w:rPr>
-          <w:rStyle w:val="CodeChar"/>
-        </w:rPr>
-        <w:t xml:space="preserve">compose</w:t>
-      </w:r>
-      <w:r>
-        <w:t xml:space="preserve">: Llama 3.3 writes a short briefing in Jarvis's voice (retried on failure).</w:t>
-      </w:r>
-    </w:p>
-    <w:p>
-      <w:pPr>
-        <w:pStyle w:val="ListParagraph"/>
-        <w:numPr>
-          <w:ilvl w:val="0"/>
-          <w:numId w:val="11"/>
-        </w:numPr>
-      </w:pPr>
-      <w:r>
-        <w:t xml:space="preserve">Step 3, </w:t>
-      </w:r>
-      <w:r>
-        <w:rPr>
-          <w:rStyle w:val="CodeChar"/>
-        </w:rPr>
-        <w:t xml:space="preserve">deliver</w:t>
-      </w:r>
-      <w:r>
-        <w:t xml:space="preserve">: call the agent's </w:t>
-      </w:r>
-      <w:r>
-        <w:rPr>
-          <w:rStyle w:val="CodeChar"/>
-        </w:rPr>
-        <w:t xml:space="preserve">saveBriefing()</w:t>
-      </w:r>
-      <w:r>
-        <w:t xml:space="preserve">, which writes </w:t>
-      </w:r>
-      <w:r>
-        <w:rPr>
-          <w:rStyle w:val="CodeChar"/>
-        </w:rPr>
-        <w:t xml:space="preserve">lastBriefing</w:t>
-      </w:r>
-      <w:r>
-        <w:t xml:space="preserve"> and sets </w:t>
-      </w:r>
-      <w:r>
-        <w:rPr>
-          <w:rStyle w:val="CodeChar"/>
-        </w:rPr>
-        <w:t xml:space="preserve">workflowStatus</w:t>
-      </w:r>
-      <w:r>
-        <w:t xml:space="preserve"> back to "idle". Open tabs show it at once; otherwise it waits for the next visit.</w:t>
-      </w:r>
-    </w:p>
-    <w:p>
-      <w:pPr>
-        <w:pStyle w:val="ListParagraph"/>
-        <w:numPr>
-          <w:ilvl w:val="0"/>
-          <w:numId w:val="11"/>
-        </w:numPr>
-      </w:pPr>
-      <w:r>
-        <w:t xml:space="preserve">If </w:t>
-      </w:r>
-      <w:r>
-        <w:rPr>
-          <w:rStyle w:val="CodeChar"/>
-        </w:rPr>
-        <w:t xml:space="preserve">compose</w:t>
-      </w:r>
-      <w:r>
-        <w:t xml:space="preserve"> still fails after its retries, the Workflow catches the error and calls the agent's </w:t>
-      </w:r>
-      <w:r>
-        <w:rPr>
-          <w:rStyle w:val="CodeChar"/>
-        </w:rPr>
-        <w:t xml:space="preserve">briefingFailed()</w:t>
-      </w:r>
-      <w:r>
-        <w:t xml:space="preserve">, which sets </w:t>
-      </w:r>
-      <w:r>
-        <w:rPr>
-          <w:rStyle w:val="CodeChar"/>
-        </w:rPr>
-        <w:t xml:space="preserve">workflowStatus</w:t>
-      </w:r>
-      <w:r>
-        <w:t xml:space="preserve"> to "failed" so the UI can show it. The agent is not told about a failed Workflow any other way.</w:t>
-      </w:r>
-    </w:p>
-    <w:p>
-      <w:pPr>
-        <w:pStyle w:val="ListParagraph"/>
-        <w:numPr>
-          <w:ilvl w:val="0"/>
-          <w:numId w:val="11"/>
-        </w:numPr>
-      </w:pPr>
-      <w:r>
-        <w:t xml:space="preserve">A "Run briefing now" button triggers the same Workflow for the demo.</w:t>
-      </w:r>
-    </w:p>
-    <w:p>
-      <w:pPr/>
-      <w:r>
-        <w:rPr>
-          <w:b/>
-        </w:rPr>
-        <w:t xml:space="preserve">D. Reminders</w:t>
-      </w:r>
-    </w:p>
-    <w:p>
-      <w:pPr>
-        <w:pStyle w:val="ListParagraph"/>
-        <w:numPr>
-          <w:ilvl w:val="0"/>
-          <w:numId w:val="16"/>
-        </w:numPr>
-      </w:pPr>
-      <w:r>
-        <w:rPr>
-          <w:rStyle w:val="CodeChar"/>
-        </w:rPr>
-        <w:t xml:space="preserve">set_reminder</w:t>
-      </w:r>
-      <w:r>
-        <w:t xml:space="preserve"> converts the requested time to a UTC timestamp and calls </w:t>
-      </w:r>
-      <w:r>
-        <w:rPr>
-          <w:rStyle w:val="CodeChar"/>
-        </w:rPr>
-        <w:t xml:space="preserve">this.schedule()</w:t>
-      </w:r>
-      <w:r>
-        <w:t xml:space="preserve">. Upcoming reminders are listed in the prompt, so the user can ask about them or cancel one with </w:t>
-      </w:r>
-      <w:r>
-        <w:rPr>
-          <w:rStyle w:val="CodeChar"/>
-        </w:rPr>
-        <w:t xml:space="preserve">cancel_reminder</w:t>
-      </w:r>
-      <w:r>
-        <w:t xml:space="preserve">.</w:t>
-      </w:r>
-    </w:p>
-    <w:p>
-      <w:pPr>
-        <w:pStyle w:val="ListParagraph"/>
-        <w:numPr>
-          <w:ilvl w:val="0"/>
-          <w:numId w:val="16"/>
-        </w:numPr>
-      </w:pPr>
-      <w:r>
-        <w:t xml:space="preserve">When a reminder fires, the agent adds it to </w:t>
-      </w:r>
-      <w:r>
-        <w:rPr>
-          <w:rStyle w:val="CodeChar"/>
-        </w:rPr>
-        <w:t xml:space="preserve">state.inbox</w:t>
-      </w:r>
-      <w:r>
-        <w:t xml:space="preserve">. Open tabs show it at once, with a browser notification if the user allowed them.</w:t>
-      </w:r>
-    </w:p>
-    <w:p>
-      <w:pPr>
-        <w:pStyle w:val="ListParagraph"/>
-        <w:numPr>
-          <w:ilvl w:val="0"/>
-          <w:numId w:val="16"/>
-        </w:numPr>
-      </w:pPr>
-      <w:r>
-        <w:t xml:space="preserve">If no tab is open, it waits in the inbox for the next visit. Delivery with no tab open (push or email) is future work.</w:t>
-      </w:r>
-    </w:p>
-    <w:p>
-      <w:pPr>
-        <w:pStyle w:val="Heading2"/>
-      </w:pPr>
-      <w:r>
         <w:t xml:space="preserve">Tools, prompt and configuration</w:t>
       </w:r>
     </w:p>
     <w:p>
       <w:pPr/>
       <w:r>
-        <w:t xml:space="preserve">Jarvis has seven tools, all of which act on its own state, so no external APIs or keys are needed. Facts are added by the extraction pass (flow B), not by a tool.</w:t>
+        <w:t xml:space="preserve">Seven built-in tools act on Jarvis's own state. Connected APIs and MCP servers add up to 15 more.</w:t>
       </w:r>
     </w:p>
     <w:tbl>
@@ -1705,7 +1669,7 @@
           <w:p>
             <w:pPr/>
             <w:r>
-              <w:t xml:space="preserve">Needs confirmation</w:t>
+              <w:t xml:space="preserve">Needs approval</w:t>
             </w:r>
           </w:p>
         </w:tc>
@@ -1873,24 +1837,18 @@
               <w:rPr>
                 <w:rStyle w:val="CodeChar"/>
               </w:rPr>
-              <w:t xml:space="preserve">set_reminder(text, when)</w:t>
-            </w:r>
-          </w:p>
-        </w:tc>
-        <w:tc>
-          <w:tcPr>
-            <w:tcW w:w="3120" w:type="dxa"/>
-          </w:tcPr>
-          <w:p>
-            <w:pPr/>
-            <w:r>
-              <w:t xml:space="preserve">Schedules a one-off reminder via </w:t>
-            </w:r>
-            <w:r>
-              <w:rPr>
-                <w:rStyle w:val="CodeChar"/>
-              </w:rPr>
-              <w:t xml:space="preserve">this.schedule()</w:t>
+              <w:t xml:space="preserve">set_reminder(text, in_minutes | at)</w:t>
+            </w:r>
+          </w:p>
+        </w:tc>
+        <w:tc>
+          <w:tcPr>
+            <w:tcW w:w="3120" w:type="dxa"/>
+          </w:tcPr>
+          <w:p>
+            <w:pPr/>
+            <w:r>
+              <w:t xml:space="preserve">Schedules a one-off reminder</w:t>
             </w:r>
           </w:p>
         </w:tc>
@@ -1928,7 +1886,7 @@
           <w:p>
             <w:pPr/>
             <w:r>
-              <w:t xml:space="preserve">Cancels a scheduled reminder</w:t>
+              <w:t xml:space="preserve">Cancels a reminder</w:t>
             </w:r>
           </w:p>
         </w:tc>
@@ -1955,18 +1913,18 @@
               <w:rPr>
                 <w:rStyle w:val="CodeChar"/>
               </w:rPr>
-              <w:t xml:space="preserve">set_briefing(time)</w:t>
-            </w:r>
-          </w:p>
-        </w:tc>
-        <w:tc>
-          <w:tcPr>
-            <w:tcW w:w="3120" w:type="dxa"/>
-          </w:tcPr>
-          <w:p>
-            <w:pPr/>
-            <w:r>
-              <w:t xml:space="preserve">Turns the daily briefing on, off or changes its time, replacing any earlier schedule</w:t>
+              <w:t xml:space="preserve">set_briefing(time | off)</w:t>
+            </w:r>
+          </w:p>
+        </w:tc>
+        <w:tc>
+          <w:tcPr>
+            <w:tcW w:w="3120" w:type="dxa"/>
+          </w:tcPr>
+          <w:p>
+            <w:pPr/>
+            <w:r>
+              <w:t xml:space="preserve">Turns the daily briefing on, off or changes its time</w:t>
             </w:r>
           </w:p>
         </w:tc>
@@ -1978,6 +1936,82 @@
             <w:pPr/>
             <w:r>
               <w:t xml:space="preserve">No</w:t>
+            </w:r>
+          </w:p>
+        </w:tc>
+      </w:tr>
+      <w:tr>
+        <w:tc>
+          <w:tcPr>
+            <w:tcW w:w="3120" w:type="dxa"/>
+          </w:tcPr>
+          <w:p>
+            <w:pPr/>
+            <w:r>
+              <w:rPr>
+                <w:rStyle w:val="CodeChar"/>
+              </w:rPr>
+              <w:t xml:space="preserve">api_&lt;name&gt;_&lt;operation&gt;</w:t>
+            </w:r>
+          </w:p>
+        </w:tc>
+        <w:tc>
+          <w:tcPr>
+            <w:tcW w:w="3120" w:type="dxa"/>
+          </w:tcPr>
+          <w:p>
+            <w:pPr/>
+            <w:r>
+              <w:t xml:space="preserve">Calls an operation of a connected OpenAPI spec</w:t>
+            </w:r>
+          </w:p>
+        </w:tc>
+        <w:tc>
+          <w:tcPr>
+            <w:tcW w:w="3120" w:type="dxa"/>
+          </w:tcPr>
+          <w:p>
+            <w:pPr/>
+            <w:r>
+              <w:t xml:space="preserve">Unless it's a GET</w:t>
+            </w:r>
+          </w:p>
+        </w:tc>
+      </w:tr>
+      <w:tr>
+        <w:tc>
+          <w:tcPr>
+            <w:tcW w:w="3120" w:type="dxa"/>
+          </w:tcPr>
+          <w:p>
+            <w:pPr/>
+            <w:r>
+              <w:rPr>
+                <w:rStyle w:val="CodeChar"/>
+              </w:rPr>
+              <w:t xml:space="preserve">tool_&lt;server&gt;_&lt;name&gt;</w:t>
+            </w:r>
+          </w:p>
+        </w:tc>
+        <w:tc>
+          <w:tcPr>
+            <w:tcW w:w="3120" w:type="dxa"/>
+          </w:tcPr>
+          <w:p>
+            <w:pPr/>
+            <w:r>
+              <w:t xml:space="preserve">Calls a tool on a connected MCP server</w:t>
+            </w:r>
+          </w:p>
+        </w:tc>
+        <w:tc>
+          <w:tcPr>
+            <w:tcW w:w="3120" w:type="dxa"/>
+          </w:tcPr>
+          <w:p>
+            <w:pPr/>
+            <w:r>
+              <w:t xml:space="preserve">Unless marked read-only</w:t>
             </w:r>
           </w:p>
         </w:tc>
@@ -1986,59 +2020,106 @@
     <w:p>
       <w:pPr/>
       <w:r>
-        <w:t xml:space="preserve">Destructive tools pause for a click in the UI (human-in-the-loop), using the pattern in the agents starter.</w:t>
-      </w:r>
-    </w:p>
-    <w:p>
-      <w:pPr/>
-      <w:r>
-        <w:rPr>
-          <w:b/>
-        </w:rPr>
-        <w:t xml:space="preserve">System prompt outline</w:t>
+        <w:rPr>
+          <w:b/>
+        </w:rPr>
+        <w:t xml:space="preserve">Keeping Llama 3.3's tool calling reliable</w:t>
+      </w:r>
+    </w:p>
+    <w:p>
+      <w:pPr>
+        <w:pStyle w:val="ListParagraph"/>
+        <w:numPr>
+          <w:ilvl w:val="0"/>
+          <w:numId w:val="4"/>
+        </w:numPr>
+      </w:pPr>
+      <w:r>
+        <w:t xml:space="preserve">The system prompt is rebuilt before every step, so memory reflects what the tools just did</w:t>
+      </w:r>
+    </w:p>
+    <w:p>
+      <w:pPr>
+        <w:pStyle w:val="ListParagraph"/>
+        <w:numPr>
+          <w:ilvl w:val="0"/>
+          <w:numId w:val="4"/>
+        </w:numPr>
+      </w:pPr>
+      <w:r>
+        <w:t xml:space="preserve">After a step where every tool call succeeded, the next step must answer in text</w:t>
+      </w:r>
+    </w:p>
+    <w:p>
+      <w:pPr>
+        <w:pStyle w:val="ListParagraph"/>
+        <w:numPr>
+          <w:ilvl w:val="0"/>
+          <w:numId w:val="4"/>
+        </w:numPr>
+      </w:pPr>
+      <w:r>
+        <w:t xml:space="preserve">Tool calls from earlier turns are left out of the history sent to the model</w:t>
+      </w:r>
+    </w:p>
+    <w:p>
+      <w:pPr>
+        <w:pStyle w:val="ListParagraph"/>
+        <w:numPr>
+          <w:ilvl w:val="0"/>
+          <w:numId w:val="4"/>
+        </w:numPr>
+      </w:pPr>
+      <w:r>
+        <w:t xml:space="preserve">Short IDs (</w:t>
+      </w:r>
+      <w:r>
+        <w:rPr>
+          <w:rStyle w:val="CodeChar"/>
+        </w:rPr>
+        <w:t xml:space="preserve">t-1a2b3c4d</w:t>
+      </w:r>
+      <w:r>
+        <w:t xml:space="preserve">) the model can copy back reliably</w:t>
+      </w:r>
+    </w:p>
+    <w:p>
+      <w:pPr>
+        <w:pStyle w:val="ListParagraph"/>
+        <w:numPr>
+          <w:ilvl w:val="0"/>
+          <w:numId w:val="4"/>
+        </w:numPr>
+      </w:pPr>
+      <w:r>
+        <w:t xml:space="preserve">A stream filter replaces "I don't need to call any function" replies with a real answer</w:t>
+      </w:r>
+    </w:p>
+    <w:p>
+      <w:pPr>
+        <w:pStyle w:val="ListParagraph"/>
+        <w:numPr>
+          <w:ilvl w:val="0"/>
+          <w:numId w:val="4"/>
+        </w:numPr>
+      </w:pPr>
+      <w:r>
+        <w:t xml:space="preserve">At most 5 steps per turn</w:t>
+      </w:r>
+    </w:p>
+    <w:p>
+      <w:pPr/>
+      <w:r>
+        <w:rPr>
+          <w:b/>
+        </w:rPr>
+        <w:t xml:space="preserve">wrangler.jsonc (main settings)</w:t>
       </w:r>
     </w:p>
     <w:p>
       <w:pPr>
         <w:pStyle w:val="Code"/>
       </w:pPr>
-      <w:bookmarkStart w:id="3" w:name="bongo_lang_text_3"/>
-      <w:bookmarkEnd w:id="3"/>
-      <w:r>
-        <w:t xml:space="preserve">You are Jarvis, a concise personal assistant.</w:t>
-        <w:br/>
-        <w:t xml:space="preserve">Today is {date}, user timezone {tz}.</w:t>
-        <w:br/>
-        <w:t xml:space="preserve">What you know about the user:</w:t>
-        <w:br/>
-        <w:t xml:space="preserve">{facts as bullets, with IDs}</w:t>
-        <w:br/>
-        <w:t xml:space="preserve">Open tasks:</w:t>
-        <w:br/>
-        <w:t xml:space="preserve">{tasks as bullets, with IDs}</w:t>
-        <w:br/>
-        <w:t xml:space="preserve">Upcoming reminders:</w:t>
-        <w:br/>
-        <w:t xml:space="preserve">{reminders with IDs and local times}</w:t>
-        <w:br/>
-        <w:t xml:space="preserve">Use tools to change tasks, reminders or memory. Never invent facts about the user.</w:t>
-      </w:r>
-    </w:p>
-    <w:p>
-      <w:pPr/>
-      <w:r>
-        <w:rPr>
-          <w:b/>
-        </w:rPr>
-        <w:t xml:space="preserve">wrangler.jsonc (bindings)</w:t>
-      </w:r>
-    </w:p>
-    <w:p>
-      <w:pPr>
-        <w:pStyle w:val="Code"/>
-      </w:pPr>
-      <w:bookmarkStart w:id="4" w:name="bongo_lang_jsonc_4"/>
-      <w:bookmarkEnd w:id="4"/>
       <w:r>
         <w:t xml:space="preserve">{</w:t>
         <w:br/>
@@ -2046,63 +2127,107 @@
         <w:br/>
         <w:t xml:space="preserve">  "main": "src/server.ts",</w:t>
         <w:br/>
-        <w:t xml:space="preserve">  "compatibility_date": "2026-10-12",</w:t>
+        <w:t xml:space="preserve">  "compatibility_date": "2026-07-21",</w:t>
         <w:br/>
         <w:t xml:space="preserve">  "compatibility_flags": ["nodejs_compat"],</w:t>
         <w:br/>
-        <w:t xml:space="preserve">  "assets": { "directory": "./public" },</w:t>
+        <w:t xml:space="preserve">  "ai": { "binding": "AI", "remote": true },</w:t>
         <w:br/>
-        <w:t xml:space="preserve">  "ai": { "binding": "AI" },</w:t>
+        <w:t xml:space="preserve">  "assets": { "directory": "./public", "not_found_handling": "single-page-application",</w:t>
         <w:br/>
-        <w:t xml:space="preserve">  "durable_objects": {</w:t>
+        <w:t xml:space="preserve">              "run_worker_first": ["/agents/*"] },</w:t>
         <w:br/>
-        <w:t xml:space="preserve">    "bindings": [{ "name": "JarvisAgent", "class_name": "JarvisAgent" }]</w:t>
-        <w:br/>
-        <w:t xml:space="preserve">  },</w:t>
+        <w:t xml:space="preserve">  "durable_objects": { "bindings": [{ "name": "JarvisAgent", "class_name": "JarvisAgent" }] },</w:t>
         <w:br/>
         <w:t xml:space="preserve">  "migrations": [{ "tag": "v1", "new_sqlite_classes": ["JarvisAgent"] }],</w:t>
         <w:br/>
-        <w:t xml:space="preserve">  "workflows": [{</w:t>
+        <w:t xml:space="preserve">  "workflows": [{ "name": "morning-briefing", "binding": "BRIEFING_WORKFLOW",</w:t>
         <w:br/>
-        <w:t xml:space="preserve">    "name": "morning-briefing",</w:t>
+        <w:t xml:space="preserve">                  "class_name": "MorningBriefingWorkflow" }],</w:t>
         <w:br/>
-        <w:t xml:space="preserve">    "binding": "BRIEFING_WORKFLOW",</w:t>
+        <w:t xml:space="preserve">  "vars": { "OLLAMA_MODEL": "gpt-oss:120b" },</w:t>
         <w:br/>
-        <w:t xml:space="preserve">    "class_name": "MorningBriefingWorkflow"</w:t>
-        <w:br/>
-        <w:t xml:space="preserve">  }],</w:t>
-        <w:br/>
-        <w:t xml:space="preserve">  "observability": { "enabled": true }</w:t>
+        <w:t xml:space="preserve">  "observability": { "enabled": true, "logs": { "enabled": true }, "traces": { "enabled": true } }</w:t>
         <w:br/>
         <w:t xml:space="preserve">}</w:t>
       </w:r>
     </w:p>
     <w:p>
-      <w:pPr/>
-      <w:r>
-        <w:t xml:space="preserve">This shows only the bindings Jarvis adds. The real file starts from the agents-starter's config, whose asset settings match its Vite build.</w:t>
-      </w:r>
-    </w:p>
-    <w:p>
       <w:pPr>
         <w:pStyle w:val="Heading2"/>
       </w:pPr>
       <w:r>
+        <w:t xml:space="preserve">When the free allowance runs out</w:t>
+      </w:r>
+    </w:p>
+    <w:p>
+      <w:pPr/>
+      <w:r>
+        <w:t xml:space="preserve">The Workers AI free tier is 10,000 neurons a day per account. Two full test runs use it up, so the app has to keep working without it and say so.</w:t>
+      </w:r>
+    </w:p>
+    <w:p>
+      <w:pPr>
+        <w:pStyle w:val="ListParagraph"/>
+        <w:numPr>
+          <w:ilvl w:val="0"/>
+          <w:numId w:val="4"/>
+        </w:numPr>
+      </w:pPr>
+      <w:r>
+        <w:t xml:space="preserve">Chat, fact extraction and the briefing fall back to Ollama Cloud. The agent remembers the limit until it resets (00:00 UTC) and skips Workers AI meanwhile; a banner explains what's happening</w:t>
+      </w:r>
+    </w:p>
+    <w:p>
+      <w:pPr>
+        <w:pStyle w:val="ListParagraph"/>
+        <w:numPr>
+          <w:ilvl w:val="0"/>
+          <w:numId w:val="4"/>
+        </w:numPr>
+      </w:pPr>
+      <w:r>
+        <w:t xml:space="preserve">Speech to text falls back to Groq Whisper, then to the browser's own recognition</w:t>
+      </w:r>
+    </w:p>
+    <w:p>
+      <w:pPr>
+        <w:pStyle w:val="ListParagraph"/>
+        <w:numPr>
+          <w:ilvl w:val="0"/>
+          <w:numId w:val="4"/>
+        </w:numPr>
+      </w:pPr>
+      <w:r>
+        <w:t xml:space="preserve">Spoken replies fall back to the browser's own voice</w:t>
+      </w:r>
+    </w:p>
+    <w:p>
+      <w:pPr>
+        <w:pStyle w:val="ListParagraph"/>
+        <w:numPr>
+          <w:ilvl w:val="0"/>
+          <w:numId w:val="4"/>
+        </w:numPr>
+      </w:pPr>
+      <w:r>
+        <w:t xml:space="preserve">Spoken replies are capped at about 600 characters, since Aura-2 costs about 2,700 neurons per 1,000 characters</w:t>
+      </w:r>
+    </w:p>
+    <w:p>
+      <w:pPr>
+        <w:pStyle w:val="Heading2"/>
+      </w:pPr>
+      <w:r>
         <w:t xml:space="preserve">Cost, scale, reliability, security and observability</w:t>
       </w:r>
     </w:p>
     <w:p>
-      <w:pPr/>
-      <w:r>
-        <w:t xml:space="preserve">The design leans on platform features for each concern rather than custom infrastructure.</w:t>
-      </w:r>
-    </w:p>
-    <w:p>
-      <w:pPr>
-        <w:pStyle w:val="ListParagraph"/>
-        <w:numPr>
-          <w:ilvl w:val="0"/>
-          <w:numId w:val="12"/>
+      <w:pPr>
+        <w:pStyle w:val="ListParagraph"/>
+        <w:numPr>
+          <w:ilvl w:val="0"/>
+          <w:numId w:val="4"/>
         </w:numPr>
       </w:pPr>
       <w:r>
@@ -2112,15 +2237,15 @@
         <w:t xml:space="preserve">Cost:</w:t>
       </w:r>
       <w:r>
-        <w:t xml:space="preserve"> agents hibernate when idle while keeping WebSockets open, and Workers bill CPU time, not time spent waiting on the LLM. An idle Jarvis costs close to nothing.</w:t>
-      </w:r>
-    </w:p>
-    <w:p>
-      <w:pPr>
-        <w:pStyle w:val="ListParagraph"/>
-        <w:numPr>
-          <w:ilvl w:val="0"/>
-          <w:numId w:val="12"/>
+        <w:t xml:space="preserve"> agents hibernate when idle, Workers bill CPU time rather than time spent waiting on the model, and speech is capped. An idle Jarvis costs close to nothing.</w:t>
+      </w:r>
+    </w:p>
+    <w:p>
+      <w:pPr>
+        <w:pStyle w:val="ListParagraph"/>
+        <w:numPr>
+          <w:ilvl w:val="0"/>
+          <w:numId w:val="4"/>
         </w:numPr>
       </w:pPr>
       <w:r>
@@ -2130,15 +2255,15 @@
         <w:t xml:space="preserve">Scale:</w:t>
       </w:r>
       <w:r>
-        <w:t xml:space="preserve"> one Durable Object per user means users never share a lock or a database; the platform scales by adding instances, not by sharding.</w:t>
-      </w:r>
-    </w:p>
-    <w:p>
-      <w:pPr>
-        <w:pStyle w:val="ListParagraph"/>
-        <w:numPr>
-          <w:ilvl w:val="0"/>
-          <w:numId w:val="12"/>
+        <w:t xml:space="preserve"> one Durable Object per user, so users never share a lock or a database; the platform scales by adding instances.</w:t>
+      </w:r>
+    </w:p>
+    <w:p>
+      <w:pPr>
+        <w:pStyle w:val="ListParagraph"/>
+        <w:numPr>
+          <w:ilvl w:val="0"/>
+          <w:numId w:val="4"/>
         </w:numPr>
       </w:pPr>
       <w:r>
@@ -2148,15 +2273,15 @@
         <w:t xml:space="preserve">Reliability:</w:t>
       </w:r>
       <w:r>
-        <w:t xml:space="preserve"> agent state survives restarts and deploys (SQLite-backed). Workflow steps are checkpointed and retried, so a failed LLM call doesn't restart the briefing.</w:t>
-      </w:r>
-    </w:p>
-    <w:p>
-      <w:pPr>
-        <w:pStyle w:val="ListParagraph"/>
-        <w:numPr>
-          <w:ilvl w:val="0"/>
-          <w:numId w:val="12"/>
+        <w:t xml:space="preserve"> state survives restarts (SQLite-backed). Workflow steps and fact extraction retry on failure, and every model has a backup.</w:t>
+      </w:r>
+    </w:p>
+    <w:p>
+      <w:pPr>
+        <w:pStyle w:val="ListParagraph"/>
+        <w:numPr>
+          <w:ilvl w:val="0"/>
+          <w:numId w:val="4"/>
         </w:numPr>
       </w:pPr>
       <w:r>
@@ -2166,15 +2291,15 @@
         <w:t xml:space="preserve">Consistency:</w:t>
       </w:r>
       <w:r>
-        <w:t xml:space="preserve"> each user's data has a single writer (their agent), which avoids race conditions without extra locking.</w:t>
-      </w:r>
-    </w:p>
-    <w:p>
-      <w:pPr>
-        <w:pStyle w:val="ListParagraph"/>
-        <w:numPr>
-          <w:ilvl w:val="0"/>
-          <w:numId w:val="12"/>
+        <w:t xml:space="preserve"> each user's data has a single writer, their agent, so there are no race conditions.</w:t>
+      </w:r>
+    </w:p>
+    <w:p>
+      <w:pPr>
+        <w:pStyle w:val="ListParagraph"/>
+        <w:numPr>
+          <w:ilvl w:val="0"/>
+          <w:numId w:val="4"/>
         </w:numPr>
       </w:pPr>
       <w:r>
@@ -2184,24 +2309,15 @@
         <w:t xml:space="preserve">Security:</w:t>
       </w:r>
       <w:r>
-        <w:t xml:space="preserve"> the demo has no login; each browser gets an unguessable instance ID. Production would put Cloudflare Access or a session check in front of </w:t>
-      </w:r>
-      <w:r>
-        <w:rPr>
-          <w:rStyle w:val="CodeChar"/>
-        </w:rPr>
-        <w:t xml:space="preserve">routeAgentRequest()</w:t>
-      </w:r>
-      <w:r>
-        <w:t xml:space="preserve">. User text is never executed; tools validate inputs.</w:t>
-      </w:r>
-    </w:p>
-    <w:p>
-      <w:pPr>
-        <w:pStyle w:val="ListParagraph"/>
-        <w:numPr>
-          <w:ilvl w:val="0"/>
-          <w:numId w:val="12"/>
+        <w:t xml:space="preserve"> no login (each browser gets an unguessable ID). Destructive and writing tools need approval, external tool output is treated as data, and API keys stay on the server, never sent to the browser or the model.</w:t>
+      </w:r>
+    </w:p>
+    <w:p>
+      <w:pPr>
+        <w:pStyle w:val="ListParagraph"/>
+        <w:numPr>
+          <w:ilvl w:val="0"/>
+          <w:numId w:val="4"/>
         </w:numPr>
       </w:pPr>
       <w:r>
@@ -2211,7 +2327,7 @@
         <w:t xml:space="preserve">Observability:</w:t>
       </w:r>
       <w:r>
-        <w:t xml:space="preserve"> Workers Observability logs every tool call and workflow step; the Workflows dashboard shows each step's status for the demo.</w:t>
+        <w:t xml:space="preserve"> Workers Logs and Traces, structured JSON logs (facts extracted, briefing posted, limit hit), and the Workflows dashboard for each briefing run.</w:t>
       </w:r>
     </w:p>
     <w:p>
@@ -2219,13 +2335,13 @@
         <w:pStyle w:val="Heading2"/>
       </w:pPr>
       <w:r>
-        <w:t xml:space="preserve">Trade-offs, alternatives and build plan</w:t>
-      </w:r>
-    </w:p>
-    <w:p>
-      <w:pPr/>
-      <w:r>
-        <w:t xml:space="preserve">The main choice is to keep everything per-user inside one agent, trading cross-user queries for simplicity and consistency.</w:t>
+        <w:t xml:space="preserve">Trade-offs, alternatives and how it was built</w:t>
+      </w:r>
+    </w:p>
+    <w:p>
+      <w:pPr/>
+      <w:r>
+        <w:t xml:space="preserve">The main choice was to keep everything per user inside one agent, trading cross-user queries for simplicity and consistency.</w:t>
       </w:r>
     </w:p>
     <w:p>
@@ -2344,7 +2460,7 @@
           <w:p>
             <w:pPr/>
             <w:r>
-              <w:t xml:space="preserve">Better recall at scale, but a few dozen facts fit in the prompt; listed as future work</w:t>
+              <w:t xml:space="preserve">Better recall at scale, but a few hundred facts fit in the prompt; future work</w:t>
             </w:r>
           </w:p>
         </w:tc>
@@ -2368,7 +2484,7 @@
           <w:p>
             <w:pPr/>
             <w:r>
-              <w:t xml:space="preserve">Works, but no per-step retries or step visibility; Workflows show durable execution</w:t>
+              <w:t xml:space="preserve">Works, but no per-step retries or visible runs</w:t>
             </w:r>
           </w:p>
         </w:tc>
@@ -2381,7 +2497,7 @@
           <w:p>
             <w:pPr/>
             <w:r>
-              <w:t xml:space="preserve">LangChain.js or another framework</w:t>
+              <w:t xml:space="preserve">Host each OpenAPI spec as its own MCP server</w:t>
             </w:r>
           </w:p>
         </w:tc>
@@ -2392,7 +2508,7 @@
           <w:p>
             <w:pPr/>
             <w:r>
-              <w:t xml:space="preserve">Adds weight and hides the platform primitives the assignment asks for</w:t>
+              <w:t xml:space="preserve">More moving parts, and an endpoint that carries API keys</w:t>
             </w:r>
           </w:p>
         </w:tc>
@@ -2405,7 +2521,7 @@
           <w:p>
             <w:pPr/>
             <w:r>
-              <w:t xml:space="preserve">External LLM via AI Gateway</w:t>
+              <w:t xml:space="preserve">A speech-to-speech model (Gemini Live, OpenAI Realtime)</w:t>
             </w:r>
           </w:p>
         </w:tc>
@@ -2416,7 +2532,55 @@
           <w:p>
             <w:pPr/>
             <w:r>
-              <w:t xml:space="preserve">Needs API keys; Workers AI keeps the demo self-contained</w:t>
+              <w:t xml:space="preserve">Would bypass Jarvis's memory and tools, and replace Llama 3.3</w:t>
+            </w:r>
+          </w:p>
+        </w:tc>
+      </w:tr>
+      <w:tr>
+        <w:tc>
+          <w:tcPr>
+            <w:tcW w:w="4680" w:type="dxa"/>
+          </w:tcPr>
+          <w:p>
+            <w:pPr/>
+            <w:r>
+              <w:t xml:space="preserve">Browser speech recognition alongside every recording</w:t>
+            </w:r>
+          </w:p>
+        </w:tc>
+        <w:tc>
+          <w:tcPr>
+            <w:tcW w:w="4680" w:type="dxa"/>
+          </w:tcPr>
+          <w:p>
+            <w:pPr/>
+            <w:r>
+              <w:t xml:space="preserve">Would send every clip to Google; it's only the last resort</w:t>
+            </w:r>
+          </w:p>
+        </w:tc>
+      </w:tr>
+      <w:tr>
+        <w:tc>
+          <w:tcPr>
+            <w:tcW w:w="4680" w:type="dxa"/>
+          </w:tcPr>
+          <w:p>
+            <w:pPr/>
+            <w:r>
+              <w:t xml:space="preserve">Workers Paid instead of backups</w:t>
+            </w:r>
+          </w:p>
+        </w:tc>
+        <w:tc>
+          <w:tcPr>
+            <w:tcW w:w="4680" w:type="dxa"/>
+          </w:tcPr>
+          <w:p>
+            <w:pPr/>
+            <w:r>
+              <w:t xml:space="preserve">Simplest for production; the backups keep the free demo working</w:t>
             </w:r>
           </w:p>
         </w:tc>
@@ -2436,167 +2600,185 @@
         <w:pStyle w:val="ListParagraph"/>
         <w:numPr>
           <w:ilvl w:val="0"/>
-          <w:numId w:val="13"/>
-        </w:numPr>
-      </w:pPr>
-      <w:r>
-        <w:t xml:space="preserve">Llama 3.3 tool calling is less reliable than frontier models; tools are kept few and simple, and arguments are validated.</w:t>
-      </w:r>
-    </w:p>
-    <w:p>
-      <w:pPr>
-        <w:pStyle w:val="ListParagraph"/>
-        <w:numPr>
-          <w:ilvl w:val="0"/>
-          <w:numId w:val="13"/>
-        </w:numPr>
-      </w:pPr>
-      <w:r>
-        <w:t xml:space="preserve">Everything goes into one prompt, and the </w:t>
+          <w:numId w:val="4"/>
+        </w:numPr>
+      </w:pPr>
+      <w:r>
+        <w:t xml:space="preserve">No sign-in: clearing site data starts a new Jarvis</w:t>
+      </w:r>
+    </w:p>
+    <w:p>
+      <w:pPr>
+        <w:pStyle w:val="ListParagraph"/>
+        <w:numPr>
+          <w:ilvl w:val="0"/>
+          <w:numId w:val="4"/>
+        </w:numPr>
+      </w:pPr>
+      <w:r>
+        <w:t xml:space="preserve">Reminders are delivered while a tab is open (with a browser notification); push delivery isn't built</w:t>
+      </w:r>
+    </w:p>
+    <w:p>
+      <w:pPr>
+        <w:pStyle w:val="ListParagraph"/>
+        <w:numPr>
+          <w:ilvl w:val="0"/>
+          <w:numId w:val="4"/>
+        </w:numPr>
+      </w:pPr>
+      <w:r>
+        <w:t xml:space="preserve">The briefing's cron is fixed in UTC, so daylight saving shifts it by an hour until it's set again</w:t>
+      </w:r>
+    </w:p>
+    <w:p>
+      <w:pPr>
+        <w:pStyle w:val="ListParagraph"/>
+        <w:numPr>
+          <w:ilvl w:val="0"/>
+          <w:numId w:val="4"/>
+        </w:numPr>
+      </w:pPr>
+      <w:r>
+        <w:t xml:space="preserve">Backups send data outside Cloudflare (Ollama, Groq; Chrome's own recognition goes to Google)</w:t>
+      </w:r>
+    </w:p>
+    <w:p>
+      <w:pPr>
+        <w:pStyle w:val="ListParagraph"/>
+        <w:numPr>
+          <w:ilvl w:val="0"/>
+          <w:numId w:val="4"/>
+        </w:numPr>
+      </w:pPr>
+      <w:r>
+        <w:t xml:space="preserve">OpenAPI 3.x only, at most 15 external tools</w:t>
+      </w:r>
+    </w:p>
+    <w:p>
+      <w:pPr>
+        <w:pStyle w:val="ListParagraph"/>
+        <w:numPr>
+          <w:ilvl w:val="0"/>
+          <w:numId w:val="4"/>
+        </w:numPr>
+      </w:pPr>
+      <w:r>
+        <w:t xml:space="preserve">Each character is a 15–19 MB download the first time</w:t>
+      </w:r>
+    </w:p>
+    <w:p>
+      <w:pPr/>
+      <w:r>
+        <w:rPr>
+          <w:b/>
+        </w:rPr>
+        <w:t xml:space="preserve">How it was built</w:t>
+      </w:r>
+    </w:p>
+    <w:p>
+      <w:pPr>
+        <w:pStyle w:val="ListParagraph"/>
+        <w:numPr>
+          <w:ilvl w:val="0"/>
+          <w:numId w:val="22"/>
+        </w:numPr>
+      </w:pPr>
+      <w:r>
+        <w:t xml:space="preserve">Design review, then a first deploy from Cloudflare's agents-starter on Llama 3.3</w:t>
+      </w:r>
+    </w:p>
+    <w:p>
+      <w:pPr>
+        <w:pStyle w:val="ListParagraph"/>
+        <w:numPr>
+          <w:ilvl w:val="0"/>
+          <w:numId w:val="22"/>
+        </w:numPr>
+      </w:pPr>
+      <w:r>
+        <w:t xml:space="preserve">Memory: facts, tasks, notes, background extraction, the side panel</w:t>
+      </w:r>
+    </w:p>
+    <w:p>
+      <w:pPr>
+        <w:pStyle w:val="ListParagraph"/>
+        <w:numPr>
+          <w:ilvl w:val="0"/>
+          <w:numId w:val="22"/>
+        </w:numPr>
+      </w:pPr>
+      <w:r>
+        <w:t xml:space="preserve">The agent acting on its own: the briefing Workflow and reminders</w:t>
+      </w:r>
+    </w:p>
+    <w:p>
+      <w:pPr>
+        <w:pStyle w:val="ListParagraph"/>
+        <w:numPr>
+          <w:ilvl w:val="0"/>
+          <w:numId w:val="22"/>
+        </w:numPr>
+      </w:pPr>
+      <w:r>
+        <w:t xml:space="preserve">Backups for when the free allowance runs out</w:t>
+      </w:r>
+    </w:p>
+    <w:p>
+      <w:pPr>
+        <w:pStyle w:val="ListParagraph"/>
+        <w:numPr>
+          <w:ilvl w:val="0"/>
+          <w:numId w:val="22"/>
+        </w:numPr>
+      </w:pPr>
+      <w:r>
+        <w:t xml:space="preserve">Voice: speech to text, spoken replies, and their backups</w:t>
+      </w:r>
+    </w:p>
+    <w:p>
+      <w:pPr>
+        <w:pStyle w:val="ListParagraph"/>
+        <w:numPr>
+          <w:ilvl w:val="0"/>
+          <w:numId w:val="22"/>
+        </w:numPr>
+      </w:pPr>
+      <w:r>
+        <w:t xml:space="preserve">Integrations: OpenAPI specs and MCP servers</w:t>
+      </w:r>
+    </w:p>
+    <w:p>
+      <w:pPr>
+        <w:pStyle w:val="ListParagraph"/>
+        <w:numPr>
+          <w:ilvl w:val="0"/>
+          <w:numId w:val="22"/>
+        </w:numPr>
+      </w:pPr>
+      <w:r>
+        <w:t xml:space="preserve">The 3D voice screen</w:t>
+      </w:r>
+    </w:p>
+    <w:p>
+      <w:pPr>
+        <w:pStyle w:val="ListParagraph"/>
+        <w:numPr>
+          <w:ilvl w:val="0"/>
+          <w:numId w:val="22"/>
+        </w:numPr>
+      </w:pPr>
+      <w:r>
+        <w:t xml:space="preserve">Each phase ended with a deploy and an end-to-end smoke test (see </w:t>
       </w:r>
       <w:r>
         <w:rPr>
           <w:rStyle w:val="CodeChar"/>
         </w:rPr>
-        <w:t xml:space="preserve">-fp8-fast</w:t>
-      </w:r>
-      <w:r>
-        <w:t xml:space="preserve"> variant's context window is much smaller than the base model's (third-party listings say 24K tokens; confirm in the catalog). The agent fills the prompt in order: system prompt and tool schemas, facts, tasks and reminders, then as much recent history as fits. That leaves room for roughly 200 short facts.</w:t>
-      </w:r>
-    </w:p>
-    <w:p>
-      <w:pPr>
-        <w:pStyle w:val="ListParagraph"/>
-        <w:numPr>
-          <w:ilvl w:val="0"/>
-          <w:numId w:val="13"/>
-        </w:numPr>
-      </w:pPr>
-      <w:r>
-        <w:t xml:space="preserve">The briefing cron is fixed in UTC, so in time zones with daylight saving it shifts by an hour until the user sets it again.</w:t>
-      </w:r>
-    </w:p>
-    <w:p>
-      <w:pPr>
-        <w:pStyle w:val="ListParagraph"/>
-        <w:numPr>
-          <w:ilvl w:val="0"/>
-          <w:numId w:val="13"/>
-        </w:numPr>
-      </w:pPr>
-      <w:r>
-        <w:t xml:space="preserve">Each Jarvis is tied to an ID in browser storage. Clearing it starts a fresh Jarvis, and the old one's data can't be reached.</w:t>
-      </w:r>
-    </w:p>
-    <w:p>
-      <w:pPr/>
-      <w:r>
-        <w:rPr>
-          <w:b/>
-        </w:rPr>
-        <w:t xml:space="preserve">Future work:</w:t>
-      </w:r>
-      <w:r>
-        <w:t xml:space="preserve"> Vectorize-backed semantic memory, reminder delivery when no tab is open (Web Push or email), email channel (Email Workers), voice replies with text-to-speech, login with Cloudflare Access.</w:t>
-      </w:r>
-    </w:p>
-    <w:p>
-      <w:pPr/>
-      <w:r>
-        <w:rPr>
-          <w:b/>
-        </w:rPr>
-        <w:t xml:space="preserve">Build plan</w:t>
-      </w:r>
-    </w:p>
-    <w:p>
-      <w:pPr/>
-      <w:r>
-        <w:t xml:space="preserve">Chat, memory, the briefing Workflow and a live URL come first; reminders and voice come after, and voice is the first thing cut if time runs short.</w:t>
-      </w:r>
-    </w:p>
-    <w:p>
-      <w:pPr>
-        <w:pStyle w:val="ListParagraph"/>
-        <w:numPr>
-          <w:ilvl w:val="0"/>
-          <w:numId w:val="14"/>
-        </w:numPr>
-      </w:pPr>
-      <w:r>
-        <w:t xml:space="preserve">Day 1: scaffold from </w:t>
-      </w:r>
-      <w:r>
-        <w:rPr>
-          <w:rStyle w:val="CodeChar"/>
-        </w:rPr>
-        <w:t xml:space="preserve">agents-starter</w:t>
-      </w:r>
-      <w:r>
-        <w:t xml:space="preserve">, switch to Llama 3.3, deploy a live URL, start </w:t>
-      </w:r>
-      <w:r>
-        <w:rPr>
-          <w:rStyle w:val="CodeChar"/>
-        </w:rPr>
-        <w:t xml:space="preserve">PROMPTS.md</w:t>
-      </w:r>
-      <w:r>
-        <w:t xml:space="preserve">.</w:t>
-      </w:r>
-    </w:p>
-    <w:p>
-      <w:pPr>
-        <w:pStyle w:val="ListParagraph"/>
-        <w:numPr>
-          <w:ilvl w:val="0"/>
-          <w:numId w:val="14"/>
-        </w:numPr>
-      </w:pPr>
-      <w:r>
-        <w:t xml:space="preserve">Day 2: SQL tables, tools, fact extraction, Memory and Tasks panels.</w:t>
-      </w:r>
-    </w:p>
-    <w:p>
-      <w:pPr>
-        <w:pStyle w:val="ListParagraph"/>
-        <w:numPr>
-          <w:ilvl w:val="0"/>
-          <w:numId w:val="14"/>
-        </w:numPr>
-      </w:pPr>
-      <w:r>
-        <w:t xml:space="preserve">Day 3: </w:t>
-      </w:r>
-      <w:r>
-        <w:rPr>
-          <w:rStyle w:val="CodeChar"/>
-        </w:rPr>
-        <w:t xml:space="preserve">MorningBriefingWorkflow</w:t>
-      </w:r>
-      <w:r>
-        <w:t xml:space="preserve"> with timezone-aware scheduling, then reminders.</w:t>
-      </w:r>
-    </w:p>
-    <w:p>
-      <w:pPr>
-        <w:pStyle w:val="ListParagraph"/>
-        <w:numPr>
-          <w:ilvl w:val="0"/>
-          <w:numId w:val="14"/>
-        </w:numPr>
-      </w:pPr>
-      <w:r>
-        <w:t xml:space="preserve">Day 4: voice input, polish, README with this architecture and the live URL, </w:t>
-      </w:r>
-      <w:r>
-        <w:rPr>
-          <w:rStyle w:val="CodeChar"/>
-        </w:rPr>
-        <w:t xml:space="preserve">PROMPTS.md</w:t>
-      </w:r>
-      <w:r>
-        <w:t xml:space="preserve"> with the AI prompt history, 2-minute demo video.</w:t>
+        <w:t xml:space="preserve">scripts/</w:t>
+      </w:r>
+      <w:r>
+        <w:t xml:space="preserve"> in the repo)</w:t>
       </w:r>
     </w:p>
     <w:p>
@@ -2939,6 +3121,42 @@
     <w:abstractNumId w:val="0"/>
   </w:num>
   <w:num w:numId="16">
+    <w:abstractNumId w:val="1"/>
+    <w:lvlOverride w:ilvl="0">
+      <w:startOverride w:val="1"/>
+    </w:lvlOverride>
+  </w:num>
+  <w:num w:numId="17">
+    <w:abstractNumId w:val="1"/>
+    <w:lvlOverride w:ilvl="0">
+      <w:startOverride w:val="1"/>
+    </w:lvlOverride>
+  </w:num>
+  <w:num w:numId="18">
+    <w:abstractNumId w:val="1"/>
+    <w:lvlOverride w:ilvl="0">
+      <w:startOverride w:val="1"/>
+    </w:lvlOverride>
+  </w:num>
+  <w:num w:numId="19">
+    <w:abstractNumId w:val="1"/>
+    <w:lvlOverride w:ilvl="0">
+      <w:startOverride w:val="1"/>
+    </w:lvlOverride>
+  </w:num>
+  <w:num w:numId="20">
+    <w:abstractNumId w:val="1"/>
+    <w:lvlOverride w:ilvl="0">
+      <w:startOverride w:val="1"/>
+    </w:lvlOverride>
+  </w:num>
+  <w:num w:numId="21">
+    <w:abstractNumId w:val="1"/>
+    <w:lvlOverride w:ilvl="0">
+      <w:startOverride w:val="1"/>
+    </w:lvlOverride>
+  </w:num>
+  <w:num w:numId="22">
     <w:abstractNumId w:val="1"/>
     <w:lvlOverride w:ilvl="0">
       <w:startOverride w:val="1"/>

</xml_diff>